<commit_message>
update: fixed the format and styling of notes
</commit_message>
<xml_diff>
--- a/ai_automation/a1_automation_using_n8n.docx
+++ b/ai_automation/a1_automation_using_n8n.docx
@@ -7,17 +7,17 @@
         <w:jc w:val="center"/>
         <w:rPr>
           <w:rFonts w:ascii="Calibri" w:hAnsi="Calibri" w:cs="Calibri"/>
-          <w:sz w:val="36"/>
-          <w:szCs w:val="36"/>
-        </w:rPr>
-      </w:pPr>
-      <w:r>
-        <w:rPr>
-          <w:rFonts w:ascii="Calibri" w:hAnsi="Calibri" w:cs="Calibri"/>
-          <w:b/>
-          <w:bCs/>
-          <w:sz w:val="44"/>
-          <w:szCs w:val="44"/>
+          <w:sz w:val="34"/>
+          <w:szCs w:val="34"/>
+        </w:rPr>
+      </w:pPr>
+      <w:r>
+        <w:rPr>
+          <w:rFonts w:ascii="Calibri" w:hAnsi="Calibri" w:cs="Calibri"/>
+          <w:b/>
+          <w:bCs/>
+          <w:sz w:val="42"/>
+          <w:szCs w:val="42"/>
         </w:rPr>
         <w:t>INDEX</w:t>
       </w:r>
@@ -66,17 +66,17 @@
           <w:rFonts w:ascii="Calibri" w:hAnsi="Calibri" w:cs="Calibri"/>
           <w:b/>
           <w:bCs/>
-          <w:sz w:val="36"/>
-          <w:szCs w:val="36"/>
-        </w:rPr>
-      </w:pPr>
-      <w:r>
-        <w:rPr>
-          <w:rFonts w:ascii="Calibri" w:hAnsi="Calibri" w:cs="Calibri"/>
-          <w:b/>
-          <w:bCs/>
-          <w:sz w:val="36"/>
-          <w:szCs w:val="36"/>
+          <w:sz w:val="34"/>
+          <w:szCs w:val="34"/>
+        </w:rPr>
+      </w:pPr>
+      <w:r>
+        <w:rPr>
+          <w:rFonts w:ascii="Calibri" w:hAnsi="Calibri" w:cs="Calibri"/>
+          <w:b/>
+          <w:bCs/>
+          <w:sz w:val="34"/>
+          <w:szCs w:val="34"/>
         </w:rPr>
         <w:lastRenderedPageBreak/>
         <w:t>Prompt Engineering Template:</w:t>
@@ -87,23 +87,23 @@
         <w:jc w:val="both"/>
         <w:rPr>
           <w:rFonts w:ascii="Calibri" w:hAnsi="Calibri" w:cs="Calibri"/>
-          <w:sz w:val="36"/>
-          <w:szCs w:val="36"/>
-        </w:rPr>
-      </w:pPr>
-      <w:r>
-        <w:rPr>
-          <w:rFonts w:ascii="Calibri" w:hAnsi="Calibri" w:cs="Calibri"/>
-          <w:sz w:val="36"/>
-          <w:szCs w:val="36"/>
+          <w:sz w:val="34"/>
+          <w:szCs w:val="34"/>
+        </w:rPr>
+      </w:pPr>
+      <w:r>
+        <w:rPr>
+          <w:rFonts w:ascii="Calibri" w:hAnsi="Calibri" w:cs="Calibri"/>
+          <w:sz w:val="34"/>
+          <w:szCs w:val="34"/>
         </w:rPr>
         <w:t xml:space="preserve"># </w:t>
       </w:r>
       <w:r>
         <w:rPr>
           <w:rFonts w:ascii="Calibri" w:hAnsi="Calibri" w:cs="Calibri"/>
-          <w:sz w:val="36"/>
-          <w:szCs w:val="36"/>
+          <w:sz w:val="34"/>
+          <w:szCs w:val="34"/>
         </w:rPr>
         <w:t xml:space="preserve">One of the common templates is </w:t>
       </w:r>
@@ -112,16 +112,16 @@
           <w:rFonts w:ascii="Calibri" w:hAnsi="Calibri" w:cs="Calibri"/>
           <w:b/>
           <w:bCs/>
-          <w:sz w:val="36"/>
-          <w:szCs w:val="36"/>
+          <w:sz w:val="34"/>
+          <w:szCs w:val="34"/>
         </w:rPr>
         <w:t>RTCROSQ</w:t>
       </w:r>
       <w:r>
         <w:rPr>
           <w:rFonts w:ascii="Calibri" w:hAnsi="Calibri" w:cs="Calibri"/>
-          <w:sz w:val="36"/>
-          <w:szCs w:val="36"/>
+          <w:sz w:val="34"/>
+          <w:szCs w:val="34"/>
         </w:rPr>
         <w:t>. Meaning:</w:t>
       </w:r>
@@ -136,25 +136,25 @@
         <w:jc w:val="both"/>
         <w:rPr>
           <w:rFonts w:ascii="Calibri" w:hAnsi="Calibri" w:cs="Calibri"/>
-          <w:sz w:val="36"/>
-          <w:szCs w:val="36"/>
-        </w:rPr>
-      </w:pPr>
-      <w:r>
-        <w:rPr>
-          <w:rFonts w:ascii="Calibri" w:hAnsi="Calibri" w:cs="Calibri"/>
-          <w:b/>
-          <w:bCs/>
-          <w:sz w:val="36"/>
-          <w:szCs w:val="36"/>
+          <w:sz w:val="34"/>
+          <w:szCs w:val="34"/>
+        </w:rPr>
+      </w:pPr>
+      <w:r>
+        <w:rPr>
+          <w:rFonts w:ascii="Calibri" w:hAnsi="Calibri" w:cs="Calibri"/>
+          <w:b/>
+          <w:bCs/>
+          <w:sz w:val="34"/>
+          <w:szCs w:val="34"/>
         </w:rPr>
         <w:t>R</w:t>
       </w:r>
       <w:r>
         <w:rPr>
           <w:rFonts w:ascii="Calibri" w:hAnsi="Calibri" w:cs="Calibri"/>
-          <w:sz w:val="36"/>
-          <w:szCs w:val="36"/>
+          <w:sz w:val="34"/>
+          <w:szCs w:val="34"/>
         </w:rPr>
         <w:t xml:space="preserve"> - Role Assign:</w:t>
       </w:r>
@@ -169,25 +169,25 @@
         <w:jc w:val="both"/>
         <w:rPr>
           <w:rFonts w:ascii="Calibri" w:hAnsi="Calibri" w:cs="Calibri"/>
-          <w:sz w:val="36"/>
-          <w:szCs w:val="36"/>
-        </w:rPr>
-      </w:pPr>
-      <w:r>
-        <w:rPr>
-          <w:rFonts w:ascii="Calibri" w:hAnsi="Calibri" w:cs="Calibri"/>
-          <w:b/>
-          <w:bCs/>
-          <w:sz w:val="36"/>
-          <w:szCs w:val="36"/>
+          <w:sz w:val="34"/>
+          <w:szCs w:val="34"/>
+        </w:rPr>
+      </w:pPr>
+      <w:r>
+        <w:rPr>
+          <w:rFonts w:ascii="Calibri" w:hAnsi="Calibri" w:cs="Calibri"/>
+          <w:b/>
+          <w:bCs/>
+          <w:sz w:val="34"/>
+          <w:szCs w:val="34"/>
         </w:rPr>
         <w:t xml:space="preserve">T </w:t>
       </w:r>
       <w:r>
         <w:rPr>
           <w:rFonts w:ascii="Calibri" w:hAnsi="Calibri" w:cs="Calibri"/>
-          <w:sz w:val="36"/>
-          <w:szCs w:val="36"/>
+          <w:sz w:val="34"/>
+          <w:szCs w:val="34"/>
         </w:rPr>
         <w:t>- Task:</w:t>
       </w:r>
@@ -202,25 +202,25 @@
         <w:jc w:val="both"/>
         <w:rPr>
           <w:rFonts w:ascii="Calibri" w:hAnsi="Calibri" w:cs="Calibri"/>
-          <w:sz w:val="36"/>
-          <w:szCs w:val="36"/>
-        </w:rPr>
-      </w:pPr>
-      <w:r>
-        <w:rPr>
-          <w:rFonts w:ascii="Calibri" w:hAnsi="Calibri" w:cs="Calibri"/>
-          <w:b/>
-          <w:bCs/>
-          <w:sz w:val="36"/>
-          <w:szCs w:val="36"/>
+          <w:sz w:val="34"/>
+          <w:szCs w:val="34"/>
+        </w:rPr>
+      </w:pPr>
+      <w:r>
+        <w:rPr>
+          <w:rFonts w:ascii="Calibri" w:hAnsi="Calibri" w:cs="Calibri"/>
+          <w:b/>
+          <w:bCs/>
+          <w:sz w:val="34"/>
+          <w:szCs w:val="34"/>
         </w:rPr>
         <w:t>C</w:t>
       </w:r>
       <w:r>
         <w:rPr>
           <w:rFonts w:ascii="Calibri" w:hAnsi="Calibri" w:cs="Calibri"/>
-          <w:sz w:val="36"/>
-          <w:szCs w:val="36"/>
+          <w:sz w:val="34"/>
+          <w:szCs w:val="34"/>
         </w:rPr>
         <w:t xml:space="preserve"> - Context:</w:t>
       </w:r>
@@ -235,25 +235,25 @@
         <w:jc w:val="both"/>
         <w:rPr>
           <w:rFonts w:ascii="Calibri" w:hAnsi="Calibri" w:cs="Calibri"/>
-          <w:sz w:val="36"/>
-          <w:szCs w:val="36"/>
-        </w:rPr>
-      </w:pPr>
-      <w:r>
-        <w:rPr>
-          <w:rFonts w:ascii="Calibri" w:hAnsi="Calibri" w:cs="Calibri"/>
-          <w:b/>
-          <w:bCs/>
-          <w:sz w:val="36"/>
-          <w:szCs w:val="36"/>
+          <w:sz w:val="34"/>
+          <w:szCs w:val="34"/>
+        </w:rPr>
+      </w:pPr>
+      <w:r>
+        <w:rPr>
+          <w:rFonts w:ascii="Calibri" w:hAnsi="Calibri" w:cs="Calibri"/>
+          <w:b/>
+          <w:bCs/>
+          <w:sz w:val="34"/>
+          <w:szCs w:val="34"/>
         </w:rPr>
         <w:t>R</w:t>
       </w:r>
       <w:r>
         <w:rPr>
           <w:rFonts w:ascii="Calibri" w:hAnsi="Calibri" w:cs="Calibri"/>
-          <w:sz w:val="36"/>
-          <w:szCs w:val="36"/>
+          <w:sz w:val="34"/>
+          <w:szCs w:val="34"/>
         </w:rPr>
         <w:t xml:space="preserve"> - Reasoning:</w:t>
       </w:r>
@@ -268,25 +268,25 @@
         <w:jc w:val="both"/>
         <w:rPr>
           <w:rFonts w:ascii="Calibri" w:hAnsi="Calibri" w:cs="Calibri"/>
-          <w:sz w:val="36"/>
-          <w:szCs w:val="36"/>
-        </w:rPr>
-      </w:pPr>
-      <w:r>
-        <w:rPr>
-          <w:rFonts w:ascii="Calibri" w:hAnsi="Calibri" w:cs="Calibri"/>
-          <w:b/>
-          <w:bCs/>
-          <w:sz w:val="36"/>
-          <w:szCs w:val="36"/>
+          <w:sz w:val="34"/>
+          <w:szCs w:val="34"/>
+        </w:rPr>
+      </w:pPr>
+      <w:r>
+        <w:rPr>
+          <w:rFonts w:ascii="Calibri" w:hAnsi="Calibri" w:cs="Calibri"/>
+          <w:b/>
+          <w:bCs/>
+          <w:sz w:val="34"/>
+          <w:szCs w:val="34"/>
         </w:rPr>
         <w:t>O</w:t>
       </w:r>
       <w:r>
         <w:rPr>
           <w:rFonts w:ascii="Calibri" w:hAnsi="Calibri" w:cs="Calibri"/>
-          <w:sz w:val="36"/>
-          <w:szCs w:val="36"/>
+          <w:sz w:val="34"/>
+          <w:szCs w:val="34"/>
         </w:rPr>
         <w:t xml:space="preserve"> - Output format:</w:t>
       </w:r>
@@ -301,25 +301,25 @@
         <w:jc w:val="both"/>
         <w:rPr>
           <w:rFonts w:ascii="Calibri" w:hAnsi="Calibri" w:cs="Calibri"/>
-          <w:sz w:val="36"/>
-          <w:szCs w:val="36"/>
-        </w:rPr>
-      </w:pPr>
-      <w:r>
-        <w:rPr>
-          <w:rFonts w:ascii="Calibri" w:hAnsi="Calibri" w:cs="Calibri"/>
-          <w:b/>
-          <w:bCs/>
-          <w:sz w:val="36"/>
-          <w:szCs w:val="36"/>
+          <w:sz w:val="34"/>
+          <w:szCs w:val="34"/>
+        </w:rPr>
+      </w:pPr>
+      <w:r>
+        <w:rPr>
+          <w:rFonts w:ascii="Calibri" w:hAnsi="Calibri" w:cs="Calibri"/>
+          <w:b/>
+          <w:bCs/>
+          <w:sz w:val="34"/>
+          <w:szCs w:val="34"/>
         </w:rPr>
         <w:t xml:space="preserve">S </w:t>
       </w:r>
       <w:r>
         <w:rPr>
           <w:rFonts w:ascii="Calibri" w:hAnsi="Calibri" w:cs="Calibri"/>
-          <w:sz w:val="36"/>
-          <w:szCs w:val="36"/>
+          <w:sz w:val="34"/>
+          <w:szCs w:val="34"/>
         </w:rPr>
         <w:t>- Stopping Condition:</w:t>
       </w:r>
@@ -334,25 +334,25 @@
         <w:jc w:val="both"/>
         <w:rPr>
           <w:rFonts w:ascii="Calibri" w:hAnsi="Calibri" w:cs="Calibri"/>
-          <w:sz w:val="36"/>
-          <w:szCs w:val="36"/>
-        </w:rPr>
-      </w:pPr>
-      <w:r>
-        <w:rPr>
-          <w:rFonts w:ascii="Calibri" w:hAnsi="Calibri" w:cs="Calibri"/>
-          <w:b/>
-          <w:bCs/>
-          <w:sz w:val="36"/>
-          <w:szCs w:val="36"/>
+          <w:sz w:val="34"/>
+          <w:szCs w:val="34"/>
+        </w:rPr>
+      </w:pPr>
+      <w:r>
+        <w:rPr>
+          <w:rFonts w:ascii="Calibri" w:hAnsi="Calibri" w:cs="Calibri"/>
+          <w:b/>
+          <w:bCs/>
+          <w:sz w:val="34"/>
+          <w:szCs w:val="34"/>
         </w:rPr>
         <w:t>Q</w:t>
       </w:r>
       <w:r>
         <w:rPr>
           <w:rFonts w:ascii="Calibri" w:hAnsi="Calibri" w:cs="Calibri"/>
-          <w:sz w:val="36"/>
-          <w:szCs w:val="36"/>
+          <w:sz w:val="34"/>
+          <w:szCs w:val="34"/>
         </w:rPr>
         <w:t xml:space="preserve"> - Questions:</w:t>
       </w:r>
@@ -364,15 +364,15 @@
         <w:jc w:val="both"/>
         <w:rPr>
           <w:rFonts w:ascii="Calibri" w:hAnsi="Calibri" w:cs="Calibri"/>
-          <w:sz w:val="36"/>
-          <w:szCs w:val="36"/>
-        </w:rPr>
-      </w:pPr>
-      <w:r>
-        <w:rPr>
-          <w:rFonts w:ascii="Calibri" w:hAnsi="Calibri" w:cs="Calibri"/>
-          <w:sz w:val="36"/>
-          <w:szCs w:val="36"/>
+          <w:sz w:val="34"/>
+          <w:szCs w:val="34"/>
+        </w:rPr>
+      </w:pPr>
+      <w:r>
+        <w:rPr>
+          <w:rFonts w:ascii="Calibri" w:hAnsi="Calibri" w:cs="Calibri"/>
+          <w:sz w:val="34"/>
+          <w:szCs w:val="34"/>
         </w:rPr>
         <w:t># Ready-made copy-paste:</w:t>
       </w:r>
@@ -384,15 +384,15 @@
         <w:jc w:val="both"/>
         <w:rPr>
           <w:rFonts w:ascii="Calibri" w:hAnsi="Calibri" w:cs="Calibri"/>
-          <w:sz w:val="36"/>
-          <w:szCs w:val="36"/>
-        </w:rPr>
-      </w:pPr>
-      <w:r>
-        <w:rPr>
-          <w:rFonts w:ascii="Calibri" w:hAnsi="Calibri" w:cs="Calibri"/>
-          <w:sz w:val="36"/>
-          <w:szCs w:val="36"/>
+          <w:sz w:val="34"/>
+          <w:szCs w:val="34"/>
+        </w:rPr>
+      </w:pPr>
+      <w:r>
+        <w:rPr>
+          <w:rFonts w:ascii="Calibri" w:hAnsi="Calibri" w:cs="Calibri"/>
+          <w:sz w:val="34"/>
+          <w:szCs w:val="34"/>
         </w:rPr>
         <w:t>Role Assign:</w:t>
       </w:r>
@@ -404,15 +404,15 @@
         <w:jc w:val="both"/>
         <w:rPr>
           <w:rFonts w:ascii="Calibri" w:hAnsi="Calibri" w:cs="Calibri"/>
-          <w:sz w:val="36"/>
-          <w:szCs w:val="36"/>
-        </w:rPr>
-      </w:pPr>
-      <w:r>
-        <w:rPr>
-          <w:rFonts w:ascii="Calibri" w:hAnsi="Calibri" w:cs="Calibri"/>
-          <w:sz w:val="36"/>
-          <w:szCs w:val="36"/>
+          <w:sz w:val="34"/>
+          <w:szCs w:val="34"/>
+        </w:rPr>
+      </w:pPr>
+      <w:r>
+        <w:rPr>
+          <w:rFonts w:ascii="Calibri" w:hAnsi="Calibri" w:cs="Calibri"/>
+          <w:sz w:val="34"/>
+          <w:szCs w:val="34"/>
         </w:rPr>
         <w:t>Task:</w:t>
       </w:r>
@@ -424,15 +424,15 @@
         <w:jc w:val="both"/>
         <w:rPr>
           <w:rFonts w:ascii="Calibri" w:hAnsi="Calibri" w:cs="Calibri"/>
-          <w:sz w:val="36"/>
-          <w:szCs w:val="36"/>
-        </w:rPr>
-      </w:pPr>
-      <w:r>
-        <w:rPr>
-          <w:rFonts w:ascii="Calibri" w:hAnsi="Calibri" w:cs="Calibri"/>
-          <w:sz w:val="36"/>
-          <w:szCs w:val="36"/>
+          <w:sz w:val="34"/>
+          <w:szCs w:val="34"/>
+        </w:rPr>
+      </w:pPr>
+      <w:r>
+        <w:rPr>
+          <w:rFonts w:ascii="Calibri" w:hAnsi="Calibri" w:cs="Calibri"/>
+          <w:sz w:val="34"/>
+          <w:szCs w:val="34"/>
         </w:rPr>
         <w:t>Context:</w:t>
       </w:r>
@@ -444,15 +444,15 @@
         <w:jc w:val="both"/>
         <w:rPr>
           <w:rFonts w:ascii="Calibri" w:hAnsi="Calibri" w:cs="Calibri"/>
-          <w:sz w:val="36"/>
-          <w:szCs w:val="36"/>
-        </w:rPr>
-      </w:pPr>
-      <w:r>
-        <w:rPr>
-          <w:rFonts w:ascii="Calibri" w:hAnsi="Calibri" w:cs="Calibri"/>
-          <w:sz w:val="36"/>
-          <w:szCs w:val="36"/>
+          <w:sz w:val="34"/>
+          <w:szCs w:val="34"/>
+        </w:rPr>
+      </w:pPr>
+      <w:r>
+        <w:rPr>
+          <w:rFonts w:ascii="Calibri" w:hAnsi="Calibri" w:cs="Calibri"/>
+          <w:sz w:val="34"/>
+          <w:szCs w:val="34"/>
         </w:rPr>
         <w:t>Reasoning:</w:t>
       </w:r>
@@ -464,15 +464,15 @@
         <w:jc w:val="both"/>
         <w:rPr>
           <w:rFonts w:ascii="Calibri" w:hAnsi="Calibri" w:cs="Calibri"/>
-          <w:sz w:val="36"/>
-          <w:szCs w:val="36"/>
-        </w:rPr>
-      </w:pPr>
-      <w:r>
-        <w:rPr>
-          <w:rFonts w:ascii="Calibri" w:hAnsi="Calibri" w:cs="Calibri"/>
-          <w:sz w:val="36"/>
-          <w:szCs w:val="36"/>
+          <w:sz w:val="34"/>
+          <w:szCs w:val="34"/>
+        </w:rPr>
+      </w:pPr>
+      <w:r>
+        <w:rPr>
+          <w:rFonts w:ascii="Calibri" w:hAnsi="Calibri" w:cs="Calibri"/>
+          <w:sz w:val="34"/>
+          <w:szCs w:val="34"/>
         </w:rPr>
         <w:t>Output format:</w:t>
       </w:r>
@@ -484,15 +484,15 @@
         <w:jc w:val="both"/>
         <w:rPr>
           <w:rFonts w:ascii="Calibri" w:hAnsi="Calibri" w:cs="Calibri"/>
-          <w:sz w:val="36"/>
-          <w:szCs w:val="36"/>
-        </w:rPr>
-      </w:pPr>
-      <w:r>
-        <w:rPr>
-          <w:rFonts w:ascii="Calibri" w:hAnsi="Calibri" w:cs="Calibri"/>
-          <w:sz w:val="36"/>
-          <w:szCs w:val="36"/>
+          <w:sz w:val="34"/>
+          <w:szCs w:val="34"/>
+        </w:rPr>
+      </w:pPr>
+      <w:r>
+        <w:rPr>
+          <w:rFonts w:ascii="Calibri" w:hAnsi="Calibri" w:cs="Calibri"/>
+          <w:sz w:val="34"/>
+          <w:szCs w:val="34"/>
         </w:rPr>
         <w:t>Stopping Condition:</w:t>
       </w:r>
@@ -504,15 +504,15 @@
         <w:jc w:val="both"/>
         <w:rPr>
           <w:rFonts w:ascii="Calibri" w:hAnsi="Calibri" w:cs="Calibri"/>
-          <w:sz w:val="36"/>
-          <w:szCs w:val="36"/>
-        </w:rPr>
-      </w:pPr>
-      <w:r>
-        <w:rPr>
-          <w:rFonts w:ascii="Calibri" w:hAnsi="Calibri" w:cs="Calibri"/>
-          <w:sz w:val="36"/>
-          <w:szCs w:val="36"/>
+          <w:sz w:val="34"/>
+          <w:szCs w:val="34"/>
+        </w:rPr>
+      </w:pPr>
+      <w:r>
+        <w:rPr>
+          <w:rFonts w:ascii="Calibri" w:hAnsi="Calibri" w:cs="Calibri"/>
+          <w:sz w:val="34"/>
+          <w:szCs w:val="34"/>
         </w:rPr>
         <w:t>Questions:</w:t>
       </w:r>
@@ -524,15 +524,15 @@
         <w:jc w:val="both"/>
         <w:rPr>
           <w:rFonts w:ascii="Calibri" w:hAnsi="Calibri" w:cs="Calibri"/>
-          <w:sz w:val="36"/>
-          <w:szCs w:val="36"/>
-        </w:rPr>
-      </w:pPr>
-      <w:r>
-        <w:rPr>
-          <w:rFonts w:ascii="Calibri" w:hAnsi="Calibri" w:cs="Calibri"/>
-          <w:sz w:val="36"/>
-          <w:szCs w:val="36"/>
+          <w:sz w:val="34"/>
+          <w:szCs w:val="34"/>
+        </w:rPr>
+      </w:pPr>
+      <w:r>
+        <w:rPr>
+          <w:rFonts w:ascii="Calibri" w:hAnsi="Calibri" w:cs="Calibri"/>
+          <w:sz w:val="34"/>
+          <w:szCs w:val="34"/>
         </w:rPr>
         <w:t># Example:</w:t>
       </w:r>
@@ -547,25 +547,25 @@
         <w:jc w:val="both"/>
         <w:rPr>
           <w:rFonts w:ascii="Calibri" w:hAnsi="Calibri" w:cs="Calibri"/>
-          <w:sz w:val="36"/>
-          <w:szCs w:val="36"/>
-        </w:rPr>
-      </w:pPr>
-      <w:r>
-        <w:rPr>
-          <w:rFonts w:ascii="Calibri" w:hAnsi="Calibri" w:cs="Calibri"/>
-          <w:b/>
-          <w:bCs/>
-          <w:sz w:val="36"/>
-          <w:szCs w:val="36"/>
+          <w:sz w:val="34"/>
+          <w:szCs w:val="34"/>
+        </w:rPr>
+      </w:pPr>
+      <w:r>
+        <w:rPr>
+          <w:rFonts w:ascii="Calibri" w:hAnsi="Calibri" w:cs="Calibri"/>
+          <w:b/>
+          <w:bCs/>
+          <w:sz w:val="34"/>
+          <w:szCs w:val="34"/>
         </w:rPr>
         <w:t>Role Assign:</w:t>
       </w:r>
       <w:r>
         <w:rPr>
           <w:rFonts w:ascii="Calibri" w:hAnsi="Calibri" w:cs="Calibri"/>
-          <w:sz w:val="36"/>
-          <w:szCs w:val="36"/>
+          <w:sz w:val="34"/>
+          <w:szCs w:val="34"/>
         </w:rPr>
         <w:t xml:space="preserve"> You are the world's script writer having an experience of 10 years+ in script writing.</w:t>
       </w:r>
@@ -580,25 +580,25 @@
         <w:jc w:val="both"/>
         <w:rPr>
           <w:rFonts w:ascii="Calibri" w:hAnsi="Calibri" w:cs="Calibri"/>
-          <w:sz w:val="36"/>
-          <w:szCs w:val="36"/>
-        </w:rPr>
-      </w:pPr>
-      <w:r>
-        <w:rPr>
-          <w:rFonts w:ascii="Calibri" w:hAnsi="Calibri" w:cs="Calibri"/>
-          <w:b/>
-          <w:bCs/>
-          <w:sz w:val="36"/>
-          <w:szCs w:val="36"/>
+          <w:sz w:val="34"/>
+          <w:szCs w:val="34"/>
+        </w:rPr>
+      </w:pPr>
+      <w:r>
+        <w:rPr>
+          <w:rFonts w:ascii="Calibri" w:hAnsi="Calibri" w:cs="Calibri"/>
+          <w:b/>
+          <w:bCs/>
+          <w:sz w:val="34"/>
+          <w:szCs w:val="34"/>
         </w:rPr>
         <w:t>Task:</w:t>
       </w:r>
       <w:r>
         <w:rPr>
           <w:rFonts w:ascii="Calibri" w:hAnsi="Calibri" w:cs="Calibri"/>
-          <w:sz w:val="36"/>
-          <w:szCs w:val="36"/>
+          <w:sz w:val="34"/>
+          <w:szCs w:val="34"/>
         </w:rPr>
         <w:t xml:space="preserve"> I want a 5 minit video script for AI will replace me.</w:t>
       </w:r>
@@ -613,25 +613,25 @@
         <w:jc w:val="both"/>
         <w:rPr>
           <w:rFonts w:ascii="Calibri" w:hAnsi="Calibri" w:cs="Calibri"/>
-          <w:sz w:val="36"/>
-          <w:szCs w:val="36"/>
-        </w:rPr>
-      </w:pPr>
-      <w:r>
-        <w:rPr>
-          <w:rFonts w:ascii="Calibri" w:hAnsi="Calibri" w:cs="Calibri"/>
-          <w:b/>
-          <w:bCs/>
-          <w:sz w:val="36"/>
-          <w:szCs w:val="36"/>
+          <w:sz w:val="34"/>
+          <w:szCs w:val="34"/>
+        </w:rPr>
+      </w:pPr>
+      <w:r>
+        <w:rPr>
+          <w:rFonts w:ascii="Calibri" w:hAnsi="Calibri" w:cs="Calibri"/>
+          <w:b/>
+          <w:bCs/>
+          <w:sz w:val="34"/>
+          <w:szCs w:val="34"/>
         </w:rPr>
         <w:t>Context:</w:t>
       </w:r>
       <w:r>
         <w:rPr>
           <w:rFonts w:ascii="Calibri" w:hAnsi="Calibri" w:cs="Calibri"/>
-          <w:sz w:val="36"/>
-          <w:szCs w:val="36"/>
+          <w:sz w:val="34"/>
+          <w:szCs w:val="34"/>
         </w:rPr>
         <w:t xml:space="preserve"> I am a student of the OSTAD platform and Flutter developer.</w:t>
       </w:r>
@@ -646,25 +646,25 @@
         <w:jc w:val="both"/>
         <w:rPr>
           <w:rFonts w:ascii="Calibri" w:hAnsi="Calibri" w:cs="Calibri"/>
-          <w:sz w:val="36"/>
-          <w:szCs w:val="36"/>
-        </w:rPr>
-      </w:pPr>
-      <w:r>
-        <w:rPr>
-          <w:rFonts w:ascii="Calibri" w:hAnsi="Calibri" w:cs="Calibri"/>
-          <w:b/>
-          <w:bCs/>
-          <w:sz w:val="36"/>
-          <w:szCs w:val="36"/>
+          <w:sz w:val="34"/>
+          <w:szCs w:val="34"/>
+        </w:rPr>
+      </w:pPr>
+      <w:r>
+        <w:rPr>
+          <w:rFonts w:ascii="Calibri" w:hAnsi="Calibri" w:cs="Calibri"/>
+          <w:b/>
+          <w:bCs/>
+          <w:sz w:val="34"/>
+          <w:szCs w:val="34"/>
         </w:rPr>
         <w:t>Reasoning:</w:t>
       </w:r>
       <w:r>
         <w:rPr>
           <w:rFonts w:ascii="Calibri" w:hAnsi="Calibri" w:cs="Calibri"/>
-          <w:sz w:val="36"/>
-          <w:szCs w:val="36"/>
+          <w:sz w:val="34"/>
+          <w:szCs w:val="34"/>
         </w:rPr>
         <w:t xml:space="preserve"> Research and study and include all the topics/information that have gone viral in the last 15 days.</w:t>
       </w:r>
@@ -679,25 +679,25 @@
         <w:jc w:val="both"/>
         <w:rPr>
           <w:rFonts w:ascii="Calibri" w:hAnsi="Calibri" w:cs="Calibri"/>
-          <w:sz w:val="36"/>
-          <w:szCs w:val="36"/>
-        </w:rPr>
-      </w:pPr>
-      <w:r>
-        <w:rPr>
-          <w:rFonts w:ascii="Calibri" w:hAnsi="Calibri" w:cs="Calibri"/>
-          <w:b/>
-          <w:bCs/>
-          <w:sz w:val="36"/>
-          <w:szCs w:val="36"/>
+          <w:sz w:val="34"/>
+          <w:szCs w:val="34"/>
+        </w:rPr>
+      </w:pPr>
+      <w:r>
+        <w:rPr>
+          <w:rFonts w:ascii="Calibri" w:hAnsi="Calibri" w:cs="Calibri"/>
+          <w:b/>
+          <w:bCs/>
+          <w:sz w:val="34"/>
+          <w:szCs w:val="34"/>
         </w:rPr>
         <w:t>Output format:</w:t>
       </w:r>
       <w:r>
         <w:rPr>
           <w:rFonts w:ascii="Calibri" w:hAnsi="Calibri" w:cs="Calibri"/>
-          <w:sz w:val="36"/>
-          <w:szCs w:val="36"/>
+          <w:sz w:val="34"/>
+          <w:szCs w:val="34"/>
         </w:rPr>
         <w:t xml:space="preserve"> Bengali language and in doc format. </w:t>
       </w:r>
@@ -712,17 +712,17 @@
         <w:jc w:val="both"/>
         <w:rPr>
           <w:rFonts w:ascii="Calibri" w:hAnsi="Calibri" w:cs="Calibri"/>
-          <w:sz w:val="36"/>
-          <w:szCs w:val="36"/>
-        </w:rPr>
-      </w:pPr>
-      <w:r>
-        <w:rPr>
-          <w:rFonts w:ascii="Calibri" w:hAnsi="Calibri" w:cs="Calibri"/>
-          <w:b/>
-          <w:bCs/>
-          <w:sz w:val="36"/>
-          <w:szCs w:val="36"/>
+          <w:sz w:val="34"/>
+          <w:szCs w:val="34"/>
+        </w:rPr>
+      </w:pPr>
+      <w:r>
+        <w:rPr>
+          <w:rFonts w:ascii="Calibri" w:hAnsi="Calibri" w:cs="Calibri"/>
+          <w:b/>
+          <w:bCs/>
+          <w:sz w:val="34"/>
+          <w:szCs w:val="34"/>
         </w:rPr>
         <w:lastRenderedPageBreak/>
         <w:t xml:space="preserve">Stopping Condition: </w:t>
@@ -730,8 +730,8 @@
       <w:r>
         <w:rPr>
           <w:rFonts w:ascii="Calibri" w:hAnsi="Calibri" w:cs="Calibri"/>
-          <w:sz w:val="36"/>
-          <w:szCs w:val="36"/>
+          <w:sz w:val="34"/>
+          <w:szCs w:val="34"/>
         </w:rPr>
         <w:t>The script will not be more than 2000 words and there should any mention of dollar or money in the script.</w:t>
       </w:r>
@@ -746,25 +746,25 @@
         <w:jc w:val="both"/>
         <w:rPr>
           <w:rFonts w:ascii="Calibri" w:hAnsi="Calibri" w:cs="Calibri"/>
-          <w:sz w:val="36"/>
-          <w:szCs w:val="36"/>
-        </w:rPr>
-      </w:pPr>
-      <w:r>
-        <w:rPr>
-          <w:rFonts w:ascii="Calibri" w:hAnsi="Calibri" w:cs="Calibri"/>
-          <w:b/>
-          <w:bCs/>
-          <w:sz w:val="36"/>
-          <w:szCs w:val="36"/>
+          <w:sz w:val="34"/>
+          <w:szCs w:val="34"/>
+        </w:rPr>
+      </w:pPr>
+      <w:r>
+        <w:rPr>
+          <w:rFonts w:ascii="Calibri" w:hAnsi="Calibri" w:cs="Calibri"/>
+          <w:b/>
+          <w:bCs/>
+          <w:sz w:val="34"/>
+          <w:szCs w:val="34"/>
         </w:rPr>
         <w:t>Questions:</w:t>
       </w:r>
       <w:r>
         <w:rPr>
           <w:rFonts w:ascii="Calibri" w:hAnsi="Calibri" w:cs="Calibri"/>
-          <w:sz w:val="36"/>
-          <w:szCs w:val="36"/>
+          <w:sz w:val="34"/>
+          <w:szCs w:val="34"/>
         </w:rPr>
         <w:t xml:space="preserve"> Ask me any questions for creating this</w:t>
       </w:r>
@@ -774,29 +774,29 @@
         <w:jc w:val="both"/>
         <w:rPr>
           <w:rFonts w:ascii="Calibri" w:hAnsi="Calibri" w:cs="Calibri"/>
-          <w:sz w:val="36"/>
-          <w:szCs w:val="36"/>
-        </w:rPr>
-      </w:pPr>
-    </w:p>
-    <w:p>
-      <w:pPr>
-        <w:jc w:val="both"/>
-        <w:rPr>
-          <w:rFonts w:ascii="Calibri" w:hAnsi="Calibri" w:cs="Calibri"/>
-          <w:b/>
-          <w:bCs/>
-          <w:sz w:val="36"/>
-          <w:szCs w:val="36"/>
-        </w:rPr>
-      </w:pPr>
-      <w:r>
-        <w:rPr>
-          <w:rFonts w:ascii="Calibri" w:hAnsi="Calibri" w:cs="Calibri"/>
-          <w:b/>
-          <w:bCs/>
-          <w:sz w:val="36"/>
-          <w:szCs w:val="36"/>
+          <w:sz w:val="34"/>
+          <w:szCs w:val="34"/>
+        </w:rPr>
+      </w:pPr>
+    </w:p>
+    <w:p>
+      <w:pPr>
+        <w:jc w:val="both"/>
+        <w:rPr>
+          <w:rFonts w:ascii="Calibri" w:hAnsi="Calibri" w:cs="Calibri"/>
+          <w:b/>
+          <w:bCs/>
+          <w:sz w:val="34"/>
+          <w:szCs w:val="34"/>
+        </w:rPr>
+      </w:pPr>
+      <w:r>
+        <w:rPr>
+          <w:rFonts w:ascii="Calibri" w:hAnsi="Calibri" w:cs="Calibri"/>
+          <w:b/>
+          <w:bCs/>
+          <w:sz w:val="34"/>
+          <w:szCs w:val="34"/>
         </w:rPr>
         <w:t>Opening An Account in n8n:</w:t>
       </w:r>
@@ -806,15 +806,15 @@
         <w:jc w:val="both"/>
         <w:rPr>
           <w:rFonts w:ascii="Calibri" w:hAnsi="Calibri" w:cs="Calibri"/>
-          <w:sz w:val="36"/>
-          <w:szCs w:val="36"/>
-        </w:rPr>
-      </w:pPr>
-      <w:r>
-        <w:rPr>
-          <w:rFonts w:ascii="Calibri" w:hAnsi="Calibri" w:cs="Calibri"/>
-          <w:sz w:val="36"/>
-          <w:szCs w:val="36"/>
+          <w:sz w:val="34"/>
+          <w:szCs w:val="34"/>
+        </w:rPr>
+      </w:pPr>
+      <w:r>
+        <w:rPr>
+          <w:rFonts w:ascii="Calibri" w:hAnsi="Calibri" w:cs="Calibri"/>
+          <w:sz w:val="34"/>
+          <w:szCs w:val="34"/>
         </w:rPr>
         <w:t># When opening a new account, n8n gives 14-days free trial after that free is over. So, we have to save our workflow.</w:t>
       </w:r>
@@ -824,15 +824,15 @@
         <w:jc w:val="both"/>
         <w:rPr>
           <w:rFonts w:ascii="Calibri" w:hAnsi="Calibri" w:cs="Calibri"/>
-          <w:sz w:val="36"/>
-          <w:szCs w:val="36"/>
-        </w:rPr>
-      </w:pPr>
-      <w:r>
-        <w:rPr>
-          <w:rFonts w:ascii="Calibri" w:hAnsi="Calibri" w:cs="Calibri"/>
-          <w:sz w:val="36"/>
-          <w:szCs w:val="36"/>
+          <w:sz w:val="34"/>
+          <w:szCs w:val="34"/>
+        </w:rPr>
+      </w:pPr>
+      <w:r>
+        <w:rPr>
+          <w:rFonts w:ascii="Calibri" w:hAnsi="Calibri" w:cs="Calibri"/>
+          <w:sz w:val="34"/>
+          <w:szCs w:val="34"/>
         </w:rPr>
         <w:t># But it is open source so we can host it locally on our local machine</w:t>
       </w:r>
@@ -842,29 +842,29 @@
         <w:jc w:val="both"/>
         <w:rPr>
           <w:rFonts w:ascii="Calibri" w:hAnsi="Calibri" w:cs="Calibri"/>
-          <w:sz w:val="36"/>
-          <w:szCs w:val="36"/>
-        </w:rPr>
-      </w:pPr>
-    </w:p>
-    <w:p>
-      <w:pPr>
-        <w:jc w:val="both"/>
-        <w:rPr>
-          <w:rFonts w:ascii="Calibri" w:hAnsi="Calibri" w:cs="Calibri"/>
-          <w:b/>
-          <w:bCs/>
-          <w:sz w:val="36"/>
-          <w:szCs w:val="36"/>
-        </w:rPr>
-      </w:pPr>
-      <w:r>
-        <w:rPr>
-          <w:rFonts w:ascii="Calibri" w:hAnsi="Calibri" w:cs="Calibri"/>
-          <w:b/>
-          <w:bCs/>
-          <w:sz w:val="36"/>
-          <w:szCs w:val="36"/>
+          <w:sz w:val="34"/>
+          <w:szCs w:val="34"/>
+        </w:rPr>
+      </w:pPr>
+    </w:p>
+    <w:p>
+      <w:pPr>
+        <w:jc w:val="both"/>
+        <w:rPr>
+          <w:rFonts w:ascii="Calibri" w:hAnsi="Calibri" w:cs="Calibri"/>
+          <w:b/>
+          <w:bCs/>
+          <w:sz w:val="34"/>
+          <w:szCs w:val="34"/>
+        </w:rPr>
+      </w:pPr>
+      <w:r>
+        <w:rPr>
+          <w:rFonts w:ascii="Calibri" w:hAnsi="Calibri" w:cs="Calibri"/>
+          <w:b/>
+          <w:bCs/>
+          <w:sz w:val="34"/>
+          <w:szCs w:val="34"/>
         </w:rPr>
         <w:t>Creating a Chat-bot in n8n:</w:t>
       </w:r>
@@ -874,23 +874,23 @@
         <w:jc w:val="both"/>
         <w:rPr>
           <w:rFonts w:ascii="Calibri" w:hAnsi="Calibri" w:cs="Calibri"/>
-          <w:sz w:val="36"/>
-          <w:szCs w:val="36"/>
-        </w:rPr>
-      </w:pPr>
-      <w:r>
-        <w:rPr>
-          <w:rFonts w:ascii="Calibri" w:hAnsi="Calibri" w:cs="Calibri"/>
-          <w:sz w:val="36"/>
-          <w:szCs w:val="36"/>
+          <w:sz w:val="34"/>
+          <w:szCs w:val="34"/>
+        </w:rPr>
+      </w:pPr>
+      <w:r>
+        <w:rPr>
+          <w:rFonts w:ascii="Calibri" w:hAnsi="Calibri" w:cs="Calibri"/>
+          <w:sz w:val="34"/>
+          <w:szCs w:val="34"/>
         </w:rPr>
         <w:t xml:space="preserve"># </w:t>
       </w:r>
       <w:r>
         <w:rPr>
           <w:rFonts w:ascii="Calibri" w:hAnsi="Calibri" w:cs="Calibri"/>
-          <w:sz w:val="36"/>
-          <w:szCs w:val="36"/>
+          <w:sz w:val="34"/>
+          <w:szCs w:val="34"/>
         </w:rPr>
         <w:t xml:space="preserve">First open an account in n8n and then go to overview, click on </w:t>
       </w:r>
@@ -899,16 +899,16 @@
           <w:rFonts w:ascii="Calibri" w:hAnsi="Calibri" w:cs="Calibri"/>
           <w:b/>
           <w:bCs/>
-          <w:sz w:val="36"/>
-          <w:szCs w:val="36"/>
+          <w:sz w:val="34"/>
+          <w:szCs w:val="34"/>
         </w:rPr>
         <w:t>create workflow</w:t>
       </w:r>
       <w:r>
         <w:rPr>
           <w:rFonts w:ascii="Calibri" w:hAnsi="Calibri" w:cs="Calibri"/>
-          <w:sz w:val="36"/>
-          <w:szCs w:val="36"/>
+          <w:sz w:val="34"/>
+          <w:szCs w:val="34"/>
         </w:rPr>
         <w:t xml:space="preserve">. Name the workflow from </w:t>
       </w:r>
@@ -917,16 +917,16 @@
           <w:rFonts w:ascii="Calibri" w:hAnsi="Calibri" w:cs="Calibri"/>
           <w:b/>
           <w:bCs/>
-          <w:sz w:val="36"/>
-          <w:szCs w:val="36"/>
+          <w:sz w:val="34"/>
+          <w:szCs w:val="34"/>
         </w:rPr>
         <w:t>my workflow</w:t>
       </w:r>
       <w:r>
         <w:rPr>
           <w:rFonts w:ascii="Calibri" w:hAnsi="Calibri" w:cs="Calibri"/>
-          <w:sz w:val="36"/>
-          <w:szCs w:val="36"/>
+          <w:sz w:val="34"/>
+          <w:szCs w:val="34"/>
         </w:rPr>
         <w:t xml:space="preserve"> to a different name</w:t>
       </w:r>
@@ -936,25 +936,25 @@
         <w:jc w:val="both"/>
         <w:rPr>
           <w:rFonts w:ascii="Calibri" w:hAnsi="Calibri" w:cs="Calibri"/>
-          <w:sz w:val="36"/>
-          <w:szCs w:val="36"/>
-        </w:rPr>
-      </w:pPr>
-    </w:p>
-    <w:p>
-      <w:pPr>
-        <w:jc w:val="both"/>
-        <w:rPr>
-          <w:rFonts w:ascii="Calibri" w:hAnsi="Calibri" w:cs="Calibri"/>
-          <w:sz w:val="36"/>
-          <w:szCs w:val="36"/>
-        </w:rPr>
-      </w:pPr>
-      <w:r>
-        <w:rPr>
-          <w:rFonts w:ascii="Calibri" w:hAnsi="Calibri" w:cs="Calibri"/>
-          <w:sz w:val="36"/>
-          <w:szCs w:val="36"/>
+          <w:sz w:val="34"/>
+          <w:szCs w:val="34"/>
+        </w:rPr>
+      </w:pPr>
+    </w:p>
+    <w:p>
+      <w:pPr>
+        <w:jc w:val="both"/>
+        <w:rPr>
+          <w:rFonts w:ascii="Calibri" w:hAnsi="Calibri" w:cs="Calibri"/>
+          <w:sz w:val="34"/>
+          <w:szCs w:val="34"/>
+        </w:rPr>
+      </w:pPr>
+      <w:r>
+        <w:rPr>
+          <w:rFonts w:ascii="Calibri" w:hAnsi="Calibri" w:cs="Calibri"/>
+          <w:sz w:val="34"/>
+          <w:szCs w:val="34"/>
         </w:rPr>
         <w:t>Step-1:</w:t>
       </w:r>
@@ -964,15 +964,15 @@
         <w:jc w:val="both"/>
         <w:rPr>
           <w:rFonts w:ascii="Calibri" w:hAnsi="Calibri" w:cs="Calibri"/>
-          <w:sz w:val="36"/>
-          <w:szCs w:val="36"/>
-        </w:rPr>
-      </w:pPr>
-      <w:r>
-        <w:rPr>
-          <w:rFonts w:ascii="Calibri" w:hAnsi="Calibri" w:cs="Calibri"/>
-          <w:sz w:val="36"/>
-          <w:szCs w:val="36"/>
+          <w:sz w:val="34"/>
+          <w:szCs w:val="34"/>
+        </w:rPr>
+      </w:pPr>
+      <w:r>
+        <w:rPr>
+          <w:rFonts w:ascii="Calibri" w:hAnsi="Calibri" w:cs="Calibri"/>
+          <w:sz w:val="34"/>
+          <w:szCs w:val="34"/>
         </w:rPr>
         <w:t># Open the workspace and click on add (</w:t>
       </w:r>
@@ -981,16 +981,16 @@
           <w:rFonts w:ascii="Calibri" w:hAnsi="Calibri" w:cs="Calibri"/>
           <w:b/>
           <w:bCs/>
-          <w:sz w:val="36"/>
-          <w:szCs w:val="36"/>
+          <w:sz w:val="34"/>
+          <w:szCs w:val="34"/>
         </w:rPr>
         <w:t>+</w:t>
       </w:r>
       <w:r>
         <w:rPr>
           <w:rFonts w:ascii="Calibri" w:hAnsi="Calibri" w:cs="Calibri"/>
-          <w:sz w:val="36"/>
-          <w:szCs w:val="36"/>
+          <w:sz w:val="34"/>
+          <w:szCs w:val="34"/>
         </w:rPr>
         <w:t xml:space="preserve"> icon). Then search for </w:t>
       </w:r>
@@ -999,16 +999,16 @@
           <w:rFonts w:ascii="Calibri" w:hAnsi="Calibri" w:cs="Calibri"/>
           <w:b/>
           <w:bCs/>
-          <w:sz w:val="36"/>
-          <w:szCs w:val="36"/>
+          <w:sz w:val="34"/>
+          <w:szCs w:val="34"/>
         </w:rPr>
         <w:t>chat</w:t>
       </w:r>
       <w:r>
         <w:rPr>
           <w:rFonts w:ascii="Calibri" w:hAnsi="Calibri" w:cs="Calibri"/>
-          <w:sz w:val="36"/>
-          <w:szCs w:val="36"/>
+          <w:sz w:val="34"/>
+          <w:szCs w:val="34"/>
         </w:rPr>
         <w:t xml:space="preserve">. From </w:t>
       </w:r>
@@ -1017,16 +1017,16 @@
           <w:rFonts w:ascii="Calibri" w:hAnsi="Calibri" w:cs="Calibri"/>
           <w:b/>
           <w:bCs/>
-          <w:sz w:val="36"/>
-          <w:szCs w:val="36"/>
+          <w:sz w:val="34"/>
+          <w:szCs w:val="34"/>
         </w:rPr>
         <w:t>triggers</w:t>
       </w:r>
       <w:r>
         <w:rPr>
           <w:rFonts w:ascii="Calibri" w:hAnsi="Calibri" w:cs="Calibri"/>
-          <w:sz w:val="36"/>
-          <w:szCs w:val="36"/>
+          <w:sz w:val="34"/>
+          <w:szCs w:val="34"/>
         </w:rPr>
         <w:t xml:space="preserve"> section (trigger means an event is happening like sending a message to chat bot), select </w:t>
       </w:r>
@@ -1035,16 +1035,16 @@
           <w:rFonts w:ascii="Calibri" w:hAnsi="Calibri" w:cs="Calibri"/>
           <w:b/>
           <w:bCs/>
-          <w:sz w:val="36"/>
-          <w:szCs w:val="36"/>
+          <w:sz w:val="34"/>
+          <w:szCs w:val="34"/>
         </w:rPr>
         <w:t>on new Chat event</w:t>
       </w:r>
       <w:r>
         <w:rPr>
           <w:rFonts w:ascii="Calibri" w:hAnsi="Calibri" w:cs="Calibri"/>
-          <w:sz w:val="36"/>
-          <w:szCs w:val="36"/>
+          <w:sz w:val="34"/>
+          <w:szCs w:val="34"/>
         </w:rPr>
         <w:t>. Close the menu for now</w:t>
       </w:r>
@@ -1054,25 +1054,25 @@
         <w:jc w:val="both"/>
         <w:rPr>
           <w:rFonts w:ascii="Calibri" w:hAnsi="Calibri" w:cs="Calibri"/>
-          <w:sz w:val="36"/>
-          <w:szCs w:val="36"/>
-        </w:rPr>
-      </w:pPr>
-    </w:p>
-    <w:p>
-      <w:pPr>
-        <w:jc w:val="both"/>
-        <w:rPr>
-          <w:rFonts w:ascii="Calibri" w:hAnsi="Calibri" w:cs="Calibri"/>
-          <w:sz w:val="36"/>
-          <w:szCs w:val="36"/>
-        </w:rPr>
-      </w:pPr>
-      <w:r>
-        <w:rPr>
-          <w:rFonts w:ascii="Calibri" w:hAnsi="Calibri" w:cs="Calibri"/>
-          <w:sz w:val="36"/>
-          <w:szCs w:val="36"/>
+          <w:sz w:val="34"/>
+          <w:szCs w:val="34"/>
+        </w:rPr>
+      </w:pPr>
+    </w:p>
+    <w:p>
+      <w:pPr>
+        <w:jc w:val="both"/>
+        <w:rPr>
+          <w:rFonts w:ascii="Calibri" w:hAnsi="Calibri" w:cs="Calibri"/>
+          <w:sz w:val="34"/>
+          <w:szCs w:val="34"/>
+        </w:rPr>
+      </w:pPr>
+      <w:r>
+        <w:rPr>
+          <w:rFonts w:ascii="Calibri" w:hAnsi="Calibri" w:cs="Calibri"/>
+          <w:sz w:val="34"/>
+          <w:szCs w:val="34"/>
         </w:rPr>
         <w:t>Step-2, Test:</w:t>
       </w:r>
@@ -1082,15 +1082,15 @@
         <w:jc w:val="both"/>
         <w:rPr>
           <w:rFonts w:ascii="Calibri" w:hAnsi="Calibri" w:cs="Calibri"/>
-          <w:sz w:val="36"/>
-          <w:szCs w:val="36"/>
-        </w:rPr>
-      </w:pPr>
-      <w:r>
-        <w:rPr>
-          <w:rFonts w:ascii="Calibri" w:hAnsi="Calibri" w:cs="Calibri"/>
-          <w:sz w:val="36"/>
-          <w:szCs w:val="36"/>
+          <w:sz w:val="34"/>
+          <w:szCs w:val="34"/>
+        </w:rPr>
+      </w:pPr>
+      <w:r>
+        <w:rPr>
+          <w:rFonts w:ascii="Calibri" w:hAnsi="Calibri" w:cs="Calibri"/>
+          <w:sz w:val="34"/>
+          <w:szCs w:val="34"/>
         </w:rPr>
         <w:lastRenderedPageBreak/>
         <w:t xml:space="preserve"># Test the trigger by clicking on </w:t>
@@ -1100,16 +1100,16 @@
           <w:rFonts w:ascii="Calibri" w:hAnsi="Calibri" w:cs="Calibri"/>
           <w:b/>
           <w:bCs/>
-          <w:sz w:val="36"/>
-          <w:szCs w:val="36"/>
+          <w:sz w:val="34"/>
+          <w:szCs w:val="34"/>
         </w:rPr>
         <w:t>open chat</w:t>
       </w:r>
       <w:r>
         <w:rPr>
           <w:rFonts w:ascii="Calibri" w:hAnsi="Calibri" w:cs="Calibri"/>
-          <w:sz w:val="36"/>
-          <w:szCs w:val="36"/>
+          <w:sz w:val="34"/>
+          <w:szCs w:val="34"/>
         </w:rPr>
         <w:t xml:space="preserve"> and sending </w:t>
       </w:r>
@@ -1118,32 +1118,32 @@
           <w:rFonts w:ascii="Calibri" w:hAnsi="Calibri" w:cs="Calibri"/>
           <w:b/>
           <w:bCs/>
-          <w:sz w:val="36"/>
-          <w:szCs w:val="36"/>
+          <w:sz w:val="34"/>
+          <w:szCs w:val="34"/>
         </w:rPr>
         <w:t>hi</w:t>
       </w:r>
       <w:r>
         <w:rPr>
           <w:rFonts w:ascii="Calibri" w:hAnsi="Calibri" w:cs="Calibri"/>
-          <w:sz w:val="36"/>
-          <w:szCs w:val="36"/>
+          <w:sz w:val="34"/>
+          <w:szCs w:val="34"/>
         </w:rPr>
         <w:t xml:space="preserve">.  Since there’s no AI agent is connected it will return something like this JSON </w:t>
       </w:r>
       <w:r>
         <w:rPr>
           <w:rFonts w:ascii="Calibri" w:hAnsi="Calibri" w:cs="Calibri"/>
-          <w:sz w:val="36"/>
-          <w:szCs w:val="36"/>
+          <w:sz w:val="34"/>
+          <w:szCs w:val="34"/>
         </w:rPr>
         <w:t>response</w:t>
       </w:r>
       <w:r>
         <w:rPr>
           <w:rFonts w:ascii="Calibri" w:hAnsi="Calibri" w:cs="Calibri"/>
-          <w:sz w:val="36"/>
-          <w:szCs w:val="36"/>
+          <w:sz w:val="34"/>
+          <w:szCs w:val="34"/>
         </w:rPr>
         <w:t>:</w:t>
       </w:r>
@@ -1155,17 +1155,17 @@
           <w:rFonts w:ascii="Calibri" w:hAnsi="Calibri" w:cs="Calibri"/>
           <w:b/>
           <w:bCs/>
-          <w:sz w:val="36"/>
-          <w:szCs w:val="36"/>
-        </w:rPr>
-      </w:pPr>
-      <w:r>
-        <w:rPr>
-          <w:rFonts w:ascii="Calibri" w:hAnsi="Calibri" w:cs="Calibri"/>
-          <w:b/>
-          <w:bCs/>
-          <w:sz w:val="36"/>
-          <w:szCs w:val="36"/>
+          <w:sz w:val="34"/>
+          <w:szCs w:val="34"/>
+        </w:rPr>
+      </w:pPr>
+      <w:r>
+        <w:rPr>
+          <w:rFonts w:ascii="Calibri" w:hAnsi="Calibri" w:cs="Calibri"/>
+          <w:b/>
+          <w:bCs/>
+          <w:sz w:val="34"/>
+          <w:szCs w:val="34"/>
         </w:rPr>
         <w:t xml:space="preserve">{ </w:t>
       </w:r>
@@ -1177,17 +1177,17 @@
           <w:rFonts w:ascii="Calibri" w:hAnsi="Calibri" w:cs="Calibri"/>
           <w:b/>
           <w:bCs/>
-          <w:sz w:val="36"/>
-          <w:szCs w:val="36"/>
-        </w:rPr>
-      </w:pPr>
-      <w:r>
-        <w:rPr>
-          <w:rFonts w:ascii="Calibri" w:hAnsi="Calibri" w:cs="Calibri"/>
-          <w:b/>
-          <w:bCs/>
-          <w:sz w:val="36"/>
-          <w:szCs w:val="36"/>
+          <w:sz w:val="34"/>
+          <w:szCs w:val="34"/>
+        </w:rPr>
+      </w:pPr>
+      <w:r>
+        <w:rPr>
+          <w:rFonts w:ascii="Calibri" w:hAnsi="Calibri" w:cs="Calibri"/>
+          <w:b/>
+          <w:bCs/>
+          <w:sz w:val="34"/>
+          <w:szCs w:val="34"/>
         </w:rPr>
         <w:t>"action": "sendMessage",</w:t>
       </w:r>
@@ -1199,17 +1199,17 @@
           <w:rFonts w:ascii="Calibri" w:hAnsi="Calibri" w:cs="Calibri"/>
           <w:b/>
           <w:bCs/>
-          <w:sz w:val="36"/>
-          <w:szCs w:val="36"/>
-        </w:rPr>
-      </w:pPr>
-      <w:r>
-        <w:rPr>
-          <w:rFonts w:ascii="Calibri" w:hAnsi="Calibri" w:cs="Calibri"/>
-          <w:b/>
-          <w:bCs/>
-          <w:sz w:val="36"/>
-          <w:szCs w:val="36"/>
+          <w:sz w:val="34"/>
+          <w:szCs w:val="34"/>
+        </w:rPr>
+      </w:pPr>
+      <w:r>
+        <w:rPr>
+          <w:rFonts w:ascii="Calibri" w:hAnsi="Calibri" w:cs="Calibri"/>
+          <w:b/>
+          <w:bCs/>
+          <w:sz w:val="34"/>
+          <w:szCs w:val="34"/>
         </w:rPr>
         <w:t xml:space="preserve"> "sessionId": "88a9c95fe88b494194249787e888df78", </w:t>
       </w:r>
@@ -1221,17 +1221,17 @@
           <w:rFonts w:ascii="Calibri" w:hAnsi="Calibri" w:cs="Calibri"/>
           <w:b/>
           <w:bCs/>
-          <w:sz w:val="36"/>
-          <w:szCs w:val="36"/>
-        </w:rPr>
-      </w:pPr>
-      <w:r>
-        <w:rPr>
-          <w:rFonts w:ascii="Calibri" w:hAnsi="Calibri" w:cs="Calibri"/>
-          <w:b/>
-          <w:bCs/>
-          <w:sz w:val="36"/>
-          <w:szCs w:val="36"/>
+          <w:sz w:val="34"/>
+          <w:szCs w:val="34"/>
+        </w:rPr>
+      </w:pPr>
+      <w:r>
+        <w:rPr>
+          <w:rFonts w:ascii="Calibri" w:hAnsi="Calibri" w:cs="Calibri"/>
+          <w:b/>
+          <w:bCs/>
+          <w:sz w:val="34"/>
+          <w:szCs w:val="34"/>
         </w:rPr>
         <w:t xml:space="preserve">"chatInput": "hi" </w:t>
       </w:r>
@@ -1243,17 +1243,17 @@
           <w:rFonts w:ascii="Calibri" w:hAnsi="Calibri" w:cs="Calibri"/>
           <w:b/>
           <w:bCs/>
-          <w:sz w:val="36"/>
-          <w:szCs w:val="36"/>
-        </w:rPr>
-      </w:pPr>
-      <w:r>
-        <w:rPr>
-          <w:rFonts w:ascii="Calibri" w:hAnsi="Calibri" w:cs="Calibri"/>
-          <w:b/>
-          <w:bCs/>
-          <w:sz w:val="36"/>
-          <w:szCs w:val="36"/>
+          <w:sz w:val="34"/>
+          <w:szCs w:val="34"/>
+        </w:rPr>
+      </w:pPr>
+      <w:r>
+        <w:rPr>
+          <w:rFonts w:ascii="Calibri" w:hAnsi="Calibri" w:cs="Calibri"/>
+          <w:b/>
+          <w:bCs/>
+          <w:sz w:val="34"/>
+          <w:szCs w:val="34"/>
         </w:rPr>
         <w:t>}</w:t>
       </w:r>
@@ -1263,25 +1263,25 @@
         <w:jc w:val="both"/>
         <w:rPr>
           <w:rFonts w:ascii="Calibri" w:hAnsi="Calibri" w:cs="Calibri"/>
-          <w:sz w:val="36"/>
-          <w:szCs w:val="36"/>
-        </w:rPr>
-      </w:pPr>
-    </w:p>
-    <w:p>
-      <w:pPr>
-        <w:jc w:val="both"/>
-        <w:rPr>
-          <w:rFonts w:ascii="Calibri" w:hAnsi="Calibri" w:cs="Calibri"/>
-          <w:sz w:val="36"/>
-          <w:szCs w:val="36"/>
-        </w:rPr>
-      </w:pPr>
-      <w:r>
-        <w:rPr>
-          <w:rFonts w:ascii="Calibri" w:hAnsi="Calibri" w:cs="Calibri"/>
-          <w:sz w:val="36"/>
-          <w:szCs w:val="36"/>
+          <w:sz w:val="34"/>
+          <w:szCs w:val="34"/>
+        </w:rPr>
+      </w:pPr>
+    </w:p>
+    <w:p>
+      <w:pPr>
+        <w:jc w:val="both"/>
+        <w:rPr>
+          <w:rFonts w:ascii="Calibri" w:hAnsi="Calibri" w:cs="Calibri"/>
+          <w:sz w:val="34"/>
+          <w:szCs w:val="34"/>
+        </w:rPr>
+      </w:pPr>
+      <w:r>
+        <w:rPr>
+          <w:rFonts w:ascii="Calibri" w:hAnsi="Calibri" w:cs="Calibri"/>
+          <w:sz w:val="34"/>
+          <w:szCs w:val="34"/>
         </w:rPr>
         <w:t>Step-3, Connect AI-Agent:</w:t>
       </w:r>
@@ -1291,15 +1291,15 @@
         <w:jc w:val="both"/>
         <w:rPr>
           <w:rFonts w:ascii="Calibri" w:hAnsi="Calibri" w:cs="Calibri"/>
-          <w:sz w:val="36"/>
-          <w:szCs w:val="36"/>
-        </w:rPr>
-      </w:pPr>
-      <w:r>
-        <w:rPr>
-          <w:rFonts w:ascii="Calibri" w:hAnsi="Calibri" w:cs="Calibri"/>
-          <w:sz w:val="36"/>
-          <w:szCs w:val="36"/>
+          <w:sz w:val="34"/>
+          <w:szCs w:val="34"/>
+        </w:rPr>
+      </w:pPr>
+      <w:r>
+        <w:rPr>
+          <w:rFonts w:ascii="Calibri" w:hAnsi="Calibri" w:cs="Calibri"/>
+          <w:sz w:val="34"/>
+          <w:szCs w:val="34"/>
         </w:rPr>
         <w:t xml:space="preserve"># Go to add and search </w:t>
       </w:r>
@@ -1308,16 +1308,16 @@
           <w:rFonts w:ascii="Calibri" w:hAnsi="Calibri" w:cs="Calibri"/>
           <w:b/>
           <w:bCs/>
-          <w:sz w:val="36"/>
-          <w:szCs w:val="36"/>
+          <w:sz w:val="34"/>
+          <w:szCs w:val="34"/>
         </w:rPr>
         <w:t>AI Agent</w:t>
       </w:r>
       <w:r>
         <w:rPr>
           <w:rFonts w:ascii="Calibri" w:hAnsi="Calibri" w:cs="Calibri"/>
-          <w:sz w:val="36"/>
-          <w:szCs w:val="36"/>
+          <w:sz w:val="34"/>
+          <w:szCs w:val="34"/>
         </w:rPr>
         <w:t>. Then select the first one. And for now, close the menu. Connect the chats point with left side of AI agent. Remember, left-side is input and right-side is output</w:t>
       </w:r>
@@ -1327,25 +1327,25 @@
         <w:jc w:val="both"/>
         <w:rPr>
           <w:rFonts w:ascii="Calibri" w:hAnsi="Calibri" w:cs="Calibri"/>
-          <w:sz w:val="36"/>
-          <w:szCs w:val="36"/>
-        </w:rPr>
-      </w:pPr>
-    </w:p>
-    <w:p>
-      <w:pPr>
-        <w:jc w:val="both"/>
-        <w:rPr>
-          <w:rFonts w:ascii="Calibri" w:hAnsi="Calibri" w:cs="Calibri"/>
-          <w:sz w:val="36"/>
-          <w:szCs w:val="36"/>
-        </w:rPr>
-      </w:pPr>
-      <w:r>
-        <w:rPr>
-          <w:rFonts w:ascii="Calibri" w:hAnsi="Calibri" w:cs="Calibri"/>
-          <w:sz w:val="36"/>
-          <w:szCs w:val="36"/>
+          <w:sz w:val="34"/>
+          <w:szCs w:val="34"/>
+        </w:rPr>
+      </w:pPr>
+    </w:p>
+    <w:p>
+      <w:pPr>
+        <w:jc w:val="both"/>
+        <w:rPr>
+          <w:rFonts w:ascii="Calibri" w:hAnsi="Calibri" w:cs="Calibri"/>
+          <w:sz w:val="34"/>
+          <w:szCs w:val="34"/>
+        </w:rPr>
+      </w:pPr>
+      <w:r>
+        <w:rPr>
+          <w:rFonts w:ascii="Calibri" w:hAnsi="Calibri" w:cs="Calibri"/>
+          <w:sz w:val="34"/>
+          <w:szCs w:val="34"/>
         </w:rPr>
         <w:t>Step-4, Connect Chat Model to AI-Agent:</w:t>
       </w:r>
@@ -1355,15 +1355,15 @@
         <w:jc w:val="both"/>
         <w:rPr>
           <w:rFonts w:ascii="Calibri" w:hAnsi="Calibri" w:cs="Calibri"/>
-          <w:sz w:val="36"/>
-          <w:szCs w:val="36"/>
-        </w:rPr>
-      </w:pPr>
-      <w:r>
-        <w:rPr>
-          <w:rFonts w:ascii="Calibri" w:hAnsi="Calibri" w:cs="Calibri"/>
-          <w:sz w:val="36"/>
-          <w:szCs w:val="36"/>
+          <w:sz w:val="34"/>
+          <w:szCs w:val="34"/>
+        </w:rPr>
+      </w:pPr>
+      <w:r>
+        <w:rPr>
+          <w:rFonts w:ascii="Calibri" w:hAnsi="Calibri" w:cs="Calibri"/>
+          <w:sz w:val="34"/>
+          <w:szCs w:val="34"/>
         </w:rPr>
         <w:t xml:space="preserve"># Click on </w:t>
       </w:r>
@@ -1372,16 +1372,16 @@
           <w:rFonts w:ascii="Calibri" w:hAnsi="Calibri" w:cs="Calibri"/>
           <w:b/>
           <w:bCs/>
-          <w:sz w:val="36"/>
-          <w:szCs w:val="36"/>
+          <w:sz w:val="34"/>
+          <w:szCs w:val="34"/>
         </w:rPr>
         <w:t>AI Agent</w:t>
       </w:r>
       <w:r>
         <w:rPr>
           <w:rFonts w:ascii="Calibri" w:hAnsi="Calibri" w:cs="Calibri"/>
-          <w:sz w:val="36"/>
-          <w:szCs w:val="36"/>
+          <w:sz w:val="34"/>
+          <w:szCs w:val="34"/>
         </w:rPr>
         <w:t xml:space="preserve">’s Chat Model. Search for </w:t>
       </w:r>
@@ -1390,16 +1390,16 @@
           <w:rFonts w:ascii="Calibri" w:hAnsi="Calibri" w:cs="Calibri"/>
           <w:b/>
           <w:bCs/>
-          <w:sz w:val="36"/>
-          <w:szCs w:val="36"/>
+          <w:sz w:val="34"/>
+          <w:szCs w:val="34"/>
         </w:rPr>
         <w:t>Groq</w:t>
       </w:r>
       <w:r>
         <w:rPr>
           <w:rFonts w:ascii="Calibri" w:hAnsi="Calibri" w:cs="Calibri"/>
-          <w:sz w:val="36"/>
-          <w:szCs w:val="36"/>
+          <w:sz w:val="34"/>
+          <w:szCs w:val="34"/>
         </w:rPr>
         <w:t xml:space="preserve"> (its free) and select the first one. After that when the menu is open, we have to setup credentials, go to </w:t>
       </w:r>
@@ -1408,16 +1408,16 @@
           <w:rFonts w:ascii="Calibri" w:hAnsi="Calibri" w:cs="Calibri"/>
           <w:b/>
           <w:bCs/>
-          <w:sz w:val="36"/>
-          <w:szCs w:val="36"/>
+          <w:sz w:val="34"/>
+          <w:szCs w:val="34"/>
         </w:rPr>
         <w:t>Groq.com</w:t>
       </w:r>
       <w:r>
         <w:rPr>
           <w:rFonts w:ascii="Calibri" w:hAnsi="Calibri" w:cs="Calibri"/>
-          <w:sz w:val="36"/>
-          <w:szCs w:val="36"/>
+          <w:sz w:val="34"/>
+          <w:szCs w:val="34"/>
         </w:rPr>
         <w:t xml:space="preserve"> and create an account and API key. Paste that API key in credentials</w:t>
       </w:r>
@@ -1427,15 +1427,15 @@
         <w:jc w:val="both"/>
         <w:rPr>
           <w:rFonts w:ascii="Calibri" w:hAnsi="Calibri" w:cs="Calibri"/>
-          <w:sz w:val="36"/>
-          <w:szCs w:val="36"/>
-        </w:rPr>
-      </w:pPr>
-      <w:r>
-        <w:rPr>
-          <w:rFonts w:ascii="Calibri" w:hAnsi="Calibri" w:cs="Calibri"/>
-          <w:sz w:val="36"/>
-          <w:szCs w:val="36"/>
+          <w:sz w:val="34"/>
+          <w:szCs w:val="34"/>
+        </w:rPr>
+      </w:pPr>
+      <w:r>
+        <w:rPr>
+          <w:rFonts w:ascii="Calibri" w:hAnsi="Calibri" w:cs="Calibri"/>
+          <w:sz w:val="34"/>
+          <w:szCs w:val="34"/>
         </w:rPr>
         <w:t xml:space="preserve"># Finally, select </w:t>
       </w:r>
@@ -1444,16 +1444,16 @@
           <w:rFonts w:ascii="Calibri" w:hAnsi="Calibri" w:cs="Calibri"/>
           <w:b/>
           <w:bCs/>
-          <w:sz w:val="36"/>
-          <w:szCs w:val="36"/>
+          <w:sz w:val="34"/>
+          <w:szCs w:val="34"/>
         </w:rPr>
         <w:t>meta-llama/llama-4-scout-17b-16e-instruct</w:t>
       </w:r>
       <w:r>
         <w:rPr>
           <w:rFonts w:ascii="Calibri" w:hAnsi="Calibri" w:cs="Calibri"/>
-          <w:sz w:val="36"/>
-          <w:szCs w:val="36"/>
+          <w:sz w:val="34"/>
+          <w:szCs w:val="34"/>
         </w:rPr>
         <w:t xml:space="preserve"> model which is free, powerful and support both English and Bangla</w:t>
       </w:r>
@@ -1463,25 +1463,25 @@
         <w:jc w:val="both"/>
         <w:rPr>
           <w:rFonts w:ascii="Calibri" w:hAnsi="Calibri" w:cs="Calibri"/>
-          <w:sz w:val="36"/>
-          <w:szCs w:val="36"/>
-        </w:rPr>
-      </w:pPr>
-    </w:p>
-    <w:p>
-      <w:pPr>
-        <w:jc w:val="both"/>
-        <w:rPr>
-          <w:rFonts w:ascii="Calibri" w:hAnsi="Calibri" w:cs="Calibri"/>
-          <w:sz w:val="36"/>
-          <w:szCs w:val="36"/>
-        </w:rPr>
-      </w:pPr>
-      <w:r>
-        <w:rPr>
-          <w:rFonts w:ascii="Calibri" w:hAnsi="Calibri" w:cs="Calibri"/>
-          <w:sz w:val="36"/>
-          <w:szCs w:val="36"/>
+          <w:sz w:val="34"/>
+          <w:szCs w:val="34"/>
+        </w:rPr>
+      </w:pPr>
+    </w:p>
+    <w:p>
+      <w:pPr>
+        <w:jc w:val="both"/>
+        <w:rPr>
+          <w:rFonts w:ascii="Calibri" w:hAnsi="Calibri" w:cs="Calibri"/>
+          <w:sz w:val="34"/>
+          <w:szCs w:val="34"/>
+        </w:rPr>
+      </w:pPr>
+      <w:r>
+        <w:rPr>
+          <w:rFonts w:ascii="Calibri" w:hAnsi="Calibri" w:cs="Calibri"/>
+          <w:sz w:val="34"/>
+          <w:szCs w:val="34"/>
         </w:rPr>
         <w:t>Step-5, Setup Prompt:</w:t>
       </w:r>
@@ -1491,16 +1491,17 @@
         <w:jc w:val="both"/>
         <w:rPr>
           <w:rFonts w:ascii="Calibri" w:hAnsi="Calibri" w:cs="Calibri"/>
-          <w:sz w:val="36"/>
-          <w:szCs w:val="36"/>
-        </w:rPr>
-      </w:pPr>
-      <w:r>
-        <w:rPr>
-          <w:rFonts w:ascii="Calibri" w:hAnsi="Calibri" w:cs="Calibri"/>
-          <w:sz w:val="36"/>
-          <w:szCs w:val="36"/>
-        </w:rPr>
+          <w:sz w:val="34"/>
+          <w:szCs w:val="34"/>
+        </w:rPr>
+      </w:pPr>
+      <w:r>
+        <w:rPr>
+          <w:rFonts w:ascii="Calibri" w:hAnsi="Calibri" w:cs="Calibri"/>
+          <w:sz w:val="34"/>
+          <w:szCs w:val="34"/>
+        </w:rPr>
+        <w:lastRenderedPageBreak/>
         <w:t xml:space="preserve"># Click on </w:t>
       </w:r>
       <w:r>
@@ -1508,16 +1509,16 @@
           <w:rFonts w:ascii="Calibri" w:hAnsi="Calibri" w:cs="Calibri"/>
           <w:b/>
           <w:bCs/>
-          <w:sz w:val="36"/>
-          <w:szCs w:val="36"/>
+          <w:sz w:val="34"/>
+          <w:szCs w:val="34"/>
         </w:rPr>
         <w:t>AI Agent</w:t>
       </w:r>
       <w:r>
         <w:rPr>
           <w:rFonts w:ascii="Calibri" w:hAnsi="Calibri" w:cs="Calibri"/>
-          <w:sz w:val="36"/>
-          <w:szCs w:val="36"/>
+          <w:sz w:val="34"/>
+          <w:szCs w:val="34"/>
         </w:rPr>
         <w:t xml:space="preserve"> then in </w:t>
       </w:r>
@@ -1526,16 +1527,16 @@
           <w:rFonts w:ascii="Calibri" w:hAnsi="Calibri" w:cs="Calibri"/>
           <w:b/>
           <w:bCs/>
-          <w:sz w:val="36"/>
-          <w:szCs w:val="36"/>
+          <w:sz w:val="34"/>
+          <w:szCs w:val="34"/>
         </w:rPr>
         <w:t>Source for Prompt</w:t>
       </w:r>
       <w:r>
         <w:rPr>
           <w:rFonts w:ascii="Calibri" w:hAnsi="Calibri" w:cs="Calibri"/>
-          <w:sz w:val="36"/>
-          <w:szCs w:val="36"/>
+          <w:sz w:val="34"/>
+          <w:szCs w:val="34"/>
         </w:rPr>
         <w:t xml:space="preserve"> select </w:t>
       </w:r>
@@ -1544,16 +1545,16 @@
           <w:rFonts w:ascii="Calibri" w:hAnsi="Calibri" w:cs="Calibri"/>
           <w:b/>
           <w:bCs/>
-          <w:sz w:val="36"/>
-          <w:szCs w:val="36"/>
+          <w:sz w:val="34"/>
+          <w:szCs w:val="34"/>
         </w:rPr>
         <w:t>Define Below</w:t>
       </w:r>
       <w:r>
         <w:rPr>
           <w:rFonts w:ascii="Calibri" w:hAnsi="Calibri" w:cs="Calibri"/>
-          <w:sz w:val="36"/>
-          <w:szCs w:val="36"/>
+          <w:sz w:val="34"/>
+          <w:szCs w:val="34"/>
         </w:rPr>
         <w:t xml:space="preserve">. </w:t>
       </w:r>
@@ -1563,15 +1564,15 @@
         <w:jc w:val="both"/>
         <w:rPr>
           <w:rFonts w:ascii="Calibri" w:hAnsi="Calibri" w:cs="Calibri"/>
-          <w:sz w:val="36"/>
-          <w:szCs w:val="36"/>
-        </w:rPr>
-      </w:pPr>
-      <w:r>
-        <w:rPr>
-          <w:rFonts w:ascii="Calibri" w:hAnsi="Calibri" w:cs="Calibri"/>
-          <w:sz w:val="36"/>
-          <w:szCs w:val="36"/>
+          <w:sz w:val="34"/>
+          <w:szCs w:val="34"/>
+        </w:rPr>
+      </w:pPr>
+      <w:r>
+        <w:rPr>
+          <w:rFonts w:ascii="Calibri" w:hAnsi="Calibri" w:cs="Calibri"/>
+          <w:sz w:val="34"/>
+          <w:szCs w:val="34"/>
         </w:rPr>
         <w:t xml:space="preserve"># Then in the </w:t>
       </w:r>
@@ -1580,16 +1581,16 @@
           <w:rFonts w:ascii="Calibri" w:hAnsi="Calibri" w:cs="Calibri"/>
           <w:b/>
           <w:bCs/>
-          <w:sz w:val="36"/>
-          <w:szCs w:val="36"/>
+          <w:sz w:val="34"/>
+          <w:szCs w:val="34"/>
         </w:rPr>
         <w:t>Prompt</w:t>
       </w:r>
       <w:r>
         <w:rPr>
           <w:rFonts w:ascii="Calibri" w:hAnsi="Calibri" w:cs="Calibri"/>
-          <w:sz w:val="36"/>
-          <w:szCs w:val="36"/>
+          <w:sz w:val="34"/>
+          <w:szCs w:val="34"/>
         </w:rPr>
         <w:t xml:space="preserve"> section, write our prompt like “</w:t>
       </w:r>
@@ -1598,8 +1599,8 @@
           <w:rFonts w:ascii="Calibri" w:hAnsi="Calibri" w:cs="Calibri"/>
           <w:b/>
           <w:bCs/>
-          <w:sz w:val="36"/>
-          <w:szCs w:val="36"/>
+          <w:sz w:val="34"/>
+          <w:szCs w:val="34"/>
         </w:rPr>
         <w:t>You are a doctor</w:t>
       </w:r>
@@ -1608,16 +1609,16 @@
           <w:rFonts w:ascii="Calibri" w:hAnsi="Calibri" w:cs="Calibri"/>
           <w:b/>
           <w:bCs/>
-          <w:sz w:val="36"/>
-          <w:szCs w:val="36"/>
+          <w:sz w:val="34"/>
+          <w:szCs w:val="34"/>
         </w:rPr>
         <w:t xml:space="preserve"> and ….</w:t>
       </w:r>
       <w:r>
         <w:rPr>
           <w:rFonts w:ascii="Calibri" w:hAnsi="Calibri" w:cs="Calibri"/>
-          <w:sz w:val="36"/>
-          <w:szCs w:val="36"/>
+          <w:sz w:val="34"/>
+          <w:szCs w:val="34"/>
         </w:rPr>
         <w:t xml:space="preserve">” and then from the left side drag-and-drop </w:t>
       </w:r>
@@ -1626,16 +1627,16 @@
           <w:rFonts w:ascii="Calibri" w:hAnsi="Calibri" w:cs="Calibri"/>
           <w:b/>
           <w:bCs/>
-          <w:sz w:val="36"/>
-          <w:szCs w:val="36"/>
+          <w:sz w:val="34"/>
+          <w:szCs w:val="34"/>
         </w:rPr>
         <w:t xml:space="preserve">chatInput </w:t>
       </w:r>
       <w:r>
         <w:rPr>
           <w:rFonts w:ascii="Calibri" w:hAnsi="Calibri" w:cs="Calibri"/>
-          <w:sz w:val="36"/>
-          <w:szCs w:val="36"/>
+          <w:sz w:val="34"/>
+          <w:szCs w:val="34"/>
         </w:rPr>
         <w:t xml:space="preserve">in the Prompt section. Finally click on </w:t>
       </w:r>
@@ -1644,16 +1645,16 @@
           <w:rFonts w:ascii="Calibri" w:hAnsi="Calibri" w:cs="Calibri"/>
           <w:b/>
           <w:bCs/>
-          <w:sz w:val="36"/>
-          <w:szCs w:val="36"/>
+          <w:sz w:val="34"/>
+          <w:szCs w:val="34"/>
         </w:rPr>
         <w:t>Execute step</w:t>
       </w:r>
       <w:r>
         <w:rPr>
           <w:rFonts w:ascii="Calibri" w:hAnsi="Calibri" w:cs="Calibri"/>
-          <w:sz w:val="36"/>
-          <w:szCs w:val="36"/>
+          <w:sz w:val="34"/>
+          <w:szCs w:val="34"/>
         </w:rPr>
         <w:t xml:space="preserve"> (if message not sent it will ask us to send a message)</w:t>
       </w:r>
@@ -1663,25 +1664,25 @@
         <w:jc w:val="both"/>
         <w:rPr>
           <w:rFonts w:ascii="Calibri" w:hAnsi="Calibri" w:cs="Calibri"/>
-          <w:sz w:val="36"/>
-          <w:szCs w:val="36"/>
-        </w:rPr>
-      </w:pPr>
-    </w:p>
-    <w:p>
-      <w:pPr>
-        <w:jc w:val="both"/>
-        <w:rPr>
-          <w:rFonts w:ascii="Calibri" w:hAnsi="Calibri" w:cs="Calibri"/>
-          <w:sz w:val="36"/>
-          <w:szCs w:val="36"/>
-        </w:rPr>
-      </w:pPr>
-      <w:r>
-        <w:rPr>
-          <w:rFonts w:ascii="Calibri" w:hAnsi="Calibri" w:cs="Calibri"/>
-          <w:sz w:val="36"/>
-          <w:szCs w:val="36"/>
+          <w:sz w:val="34"/>
+          <w:szCs w:val="34"/>
+        </w:rPr>
+      </w:pPr>
+    </w:p>
+    <w:p>
+      <w:pPr>
+        <w:jc w:val="both"/>
+        <w:rPr>
+          <w:rFonts w:ascii="Calibri" w:hAnsi="Calibri" w:cs="Calibri"/>
+          <w:sz w:val="34"/>
+          <w:szCs w:val="34"/>
+        </w:rPr>
+      </w:pPr>
+      <w:r>
+        <w:rPr>
+          <w:rFonts w:ascii="Calibri" w:hAnsi="Calibri" w:cs="Calibri"/>
+          <w:sz w:val="34"/>
+          <w:szCs w:val="34"/>
         </w:rPr>
         <w:t>Step-6, Publish:</w:t>
       </w:r>
@@ -1691,15 +1692,15 @@
         <w:jc w:val="both"/>
         <w:rPr>
           <w:rFonts w:ascii="Calibri" w:hAnsi="Calibri" w:cs="Calibri"/>
-          <w:sz w:val="36"/>
-          <w:szCs w:val="36"/>
-        </w:rPr>
-      </w:pPr>
-      <w:r>
-        <w:rPr>
-          <w:rFonts w:ascii="Calibri" w:hAnsi="Calibri" w:cs="Calibri"/>
-          <w:sz w:val="36"/>
-          <w:szCs w:val="36"/>
+          <w:sz w:val="34"/>
+          <w:szCs w:val="34"/>
+        </w:rPr>
+      </w:pPr>
+      <w:r>
+        <w:rPr>
+          <w:rFonts w:ascii="Calibri" w:hAnsi="Calibri" w:cs="Calibri"/>
+          <w:sz w:val="34"/>
+          <w:szCs w:val="34"/>
         </w:rPr>
         <w:t># Click on</w:t>
       </w:r>
@@ -1708,16 +1709,16 @@
           <w:rFonts w:ascii="Calibri" w:hAnsi="Calibri" w:cs="Calibri"/>
           <w:b/>
           <w:bCs/>
-          <w:sz w:val="36"/>
-          <w:szCs w:val="36"/>
+          <w:sz w:val="34"/>
+          <w:szCs w:val="34"/>
         </w:rPr>
         <w:t xml:space="preserve"> chat</w:t>
       </w:r>
       <w:r>
         <w:rPr>
           <w:rFonts w:ascii="Calibri" w:hAnsi="Calibri" w:cs="Calibri"/>
-          <w:sz w:val="36"/>
-          <w:szCs w:val="36"/>
+          <w:sz w:val="34"/>
+          <w:szCs w:val="34"/>
         </w:rPr>
         <w:t xml:space="preserve"> and enable </w:t>
       </w:r>
@@ -1726,16 +1727,16 @@
           <w:rFonts w:ascii="Calibri" w:hAnsi="Calibri" w:cs="Calibri"/>
           <w:b/>
           <w:bCs/>
-          <w:sz w:val="36"/>
-          <w:szCs w:val="36"/>
+          <w:sz w:val="34"/>
+          <w:szCs w:val="34"/>
         </w:rPr>
         <w:t>Make Chat Publicly Available</w:t>
       </w:r>
       <w:r>
         <w:rPr>
           <w:rFonts w:ascii="Calibri" w:hAnsi="Calibri" w:cs="Calibri"/>
-          <w:sz w:val="36"/>
-          <w:szCs w:val="36"/>
+          <w:sz w:val="34"/>
+          <w:szCs w:val="34"/>
         </w:rPr>
         <w:t xml:space="preserve"> Copy the link by just tapping on it.</w:t>
       </w:r>
@@ -1745,15 +1746,15 @@
         <w:jc w:val="both"/>
         <w:rPr>
           <w:rFonts w:ascii="Calibri" w:hAnsi="Calibri" w:cs="Calibri"/>
-          <w:sz w:val="36"/>
-          <w:szCs w:val="36"/>
-        </w:rPr>
-      </w:pPr>
-      <w:r>
-        <w:rPr>
-          <w:rFonts w:ascii="Calibri" w:hAnsi="Calibri" w:cs="Calibri"/>
-          <w:sz w:val="36"/>
-          <w:szCs w:val="36"/>
+          <w:sz w:val="34"/>
+          <w:szCs w:val="34"/>
+        </w:rPr>
+      </w:pPr>
+      <w:r>
+        <w:rPr>
+          <w:rFonts w:ascii="Calibri" w:hAnsi="Calibri" w:cs="Calibri"/>
+          <w:sz w:val="34"/>
+          <w:szCs w:val="34"/>
         </w:rPr>
         <w:t># Then finally in workspace on the very top right side, hit Publish. Our chat bot is public now. Go to the copied link in a browser and talk to it</w:t>
       </w:r>
@@ -1763,15 +1764,15 @@
         <w:jc w:val="both"/>
         <w:rPr>
           <w:rFonts w:ascii="Calibri" w:hAnsi="Calibri" w:cs="Calibri"/>
-          <w:sz w:val="36"/>
-          <w:szCs w:val="36"/>
-        </w:rPr>
-      </w:pPr>
-      <w:r>
-        <w:rPr>
-          <w:rFonts w:ascii="Calibri" w:hAnsi="Calibri" w:cs="Calibri"/>
-          <w:sz w:val="36"/>
-          <w:szCs w:val="36"/>
+          <w:sz w:val="34"/>
+          <w:szCs w:val="34"/>
+        </w:rPr>
+      </w:pPr>
+      <w:r>
+        <w:rPr>
+          <w:rFonts w:ascii="Calibri" w:hAnsi="Calibri" w:cs="Calibri"/>
+          <w:sz w:val="34"/>
+          <w:szCs w:val="34"/>
         </w:rPr>
         <w:t># Unpublish by clicking on the side down arrow of publish</w:t>
       </w:r>
@@ -1781,25 +1782,25 @@
         <w:jc w:val="both"/>
         <w:rPr>
           <w:rFonts w:ascii="Calibri" w:hAnsi="Calibri" w:cs="Calibri"/>
-          <w:sz w:val="36"/>
-          <w:szCs w:val="36"/>
-        </w:rPr>
-      </w:pPr>
-    </w:p>
-    <w:p>
-      <w:pPr>
-        <w:jc w:val="both"/>
-        <w:rPr>
-          <w:rFonts w:ascii="Calibri" w:hAnsi="Calibri" w:cs="Calibri"/>
-          <w:sz w:val="36"/>
-          <w:szCs w:val="36"/>
-        </w:rPr>
-      </w:pPr>
-      <w:r>
-        <w:rPr>
-          <w:rFonts w:ascii="Calibri" w:hAnsi="Calibri" w:cs="Calibri"/>
-          <w:sz w:val="36"/>
-          <w:szCs w:val="36"/>
+          <w:sz w:val="34"/>
+          <w:szCs w:val="34"/>
+        </w:rPr>
+      </w:pPr>
+    </w:p>
+    <w:p>
+      <w:pPr>
+        <w:jc w:val="both"/>
+        <w:rPr>
+          <w:rFonts w:ascii="Calibri" w:hAnsi="Calibri" w:cs="Calibri"/>
+          <w:sz w:val="34"/>
+          <w:szCs w:val="34"/>
+        </w:rPr>
+      </w:pPr>
+      <w:r>
+        <w:rPr>
+          <w:rFonts w:ascii="Calibri" w:hAnsi="Calibri" w:cs="Calibri"/>
+          <w:sz w:val="34"/>
+          <w:szCs w:val="34"/>
         </w:rPr>
         <w:t>Downloading Workflow:</w:t>
       </w:r>
@@ -1809,15 +1810,15 @@
         <w:jc w:val="both"/>
         <w:rPr>
           <w:rFonts w:ascii="Calibri" w:hAnsi="Calibri" w:cs="Calibri"/>
-          <w:sz w:val="36"/>
-          <w:szCs w:val="36"/>
-        </w:rPr>
-      </w:pPr>
-      <w:r>
-        <w:rPr>
-          <w:rFonts w:ascii="Calibri" w:hAnsi="Calibri" w:cs="Calibri"/>
-          <w:sz w:val="36"/>
-          <w:szCs w:val="36"/>
+          <w:sz w:val="34"/>
+          <w:szCs w:val="34"/>
+        </w:rPr>
+      </w:pPr>
+      <w:r>
+        <w:rPr>
+          <w:rFonts w:ascii="Calibri" w:hAnsi="Calibri" w:cs="Calibri"/>
+          <w:sz w:val="34"/>
+          <w:szCs w:val="34"/>
         </w:rPr>
         <w:t xml:space="preserve"># Just go to work space of the workflow and on then very top-right side, click on three dots and hit </w:t>
       </w:r>
@@ -1826,16 +1827,16 @@
           <w:rFonts w:ascii="Calibri" w:hAnsi="Calibri" w:cs="Calibri"/>
           <w:b/>
           <w:bCs/>
-          <w:sz w:val="36"/>
-          <w:szCs w:val="36"/>
+          <w:sz w:val="34"/>
+          <w:szCs w:val="34"/>
         </w:rPr>
         <w:t>Download</w:t>
       </w:r>
       <w:r>
         <w:rPr>
           <w:rFonts w:ascii="Calibri" w:hAnsi="Calibri" w:cs="Calibri"/>
-          <w:sz w:val="36"/>
-          <w:szCs w:val="36"/>
+          <w:sz w:val="34"/>
+          <w:szCs w:val="34"/>
         </w:rPr>
         <w:t xml:space="preserve">. It will be downloaded as a JSON file (like </w:t>
       </w:r>
@@ -1844,16 +1845,16 @@
           <w:rFonts w:ascii="Calibri" w:hAnsi="Calibri" w:cs="Calibri"/>
           <w:b/>
           <w:bCs/>
-          <w:sz w:val="36"/>
-          <w:szCs w:val="36"/>
+          <w:sz w:val="34"/>
+          <w:szCs w:val="34"/>
         </w:rPr>
         <w:t>Fire.json</w:t>
       </w:r>
       <w:r>
         <w:rPr>
           <w:rFonts w:ascii="Calibri" w:hAnsi="Calibri" w:cs="Calibri"/>
-          <w:sz w:val="36"/>
-          <w:szCs w:val="36"/>
+          <w:sz w:val="34"/>
+          <w:szCs w:val="34"/>
         </w:rPr>
         <w:t>)</w:t>
       </w:r>
@@ -1863,15 +1864,15 @@
         <w:jc w:val="both"/>
         <w:rPr>
           <w:rFonts w:ascii="Calibri" w:hAnsi="Calibri" w:cs="Calibri"/>
-          <w:sz w:val="36"/>
-          <w:szCs w:val="36"/>
-        </w:rPr>
-      </w:pPr>
-      <w:r>
-        <w:rPr>
-          <w:rFonts w:ascii="Calibri" w:hAnsi="Calibri" w:cs="Calibri"/>
-          <w:sz w:val="36"/>
-          <w:szCs w:val="36"/>
+          <w:sz w:val="34"/>
+          <w:szCs w:val="34"/>
+        </w:rPr>
+      </w:pPr>
+      <w:r>
+        <w:rPr>
+          <w:rFonts w:ascii="Calibri" w:hAnsi="Calibri" w:cs="Calibri"/>
+          <w:sz w:val="34"/>
+          <w:szCs w:val="34"/>
         </w:rPr>
         <w:t xml:space="preserve"># If we want to delete a workflow just </w:t>
       </w:r>
@@ -1880,16 +1881,16 @@
           <w:rFonts w:ascii="Calibri" w:hAnsi="Calibri" w:cs="Calibri"/>
           <w:b/>
           <w:bCs/>
-          <w:sz w:val="36"/>
-          <w:szCs w:val="36"/>
+          <w:sz w:val="34"/>
+          <w:szCs w:val="34"/>
         </w:rPr>
         <w:t>Archive</w:t>
       </w:r>
       <w:r>
         <w:rPr>
           <w:rFonts w:ascii="Calibri" w:hAnsi="Calibri" w:cs="Calibri"/>
-          <w:sz w:val="36"/>
-          <w:szCs w:val="36"/>
+          <w:sz w:val="34"/>
+          <w:szCs w:val="34"/>
         </w:rPr>
         <w:t xml:space="preserve"> it and, on the pop, up message </w:t>
       </w:r>
@@ -1898,8 +1899,8 @@
           <w:rFonts w:ascii="Calibri" w:hAnsi="Calibri" w:cs="Calibri"/>
           <w:b/>
           <w:bCs/>
-          <w:sz w:val="36"/>
-          <w:szCs w:val="36"/>
+          <w:sz w:val="34"/>
+          <w:szCs w:val="34"/>
         </w:rPr>
         <w:t>Delete Permanently</w:t>
       </w:r>
@@ -1909,25 +1910,25 @@
         <w:jc w:val="both"/>
         <w:rPr>
           <w:rFonts w:ascii="Calibri" w:hAnsi="Calibri" w:cs="Calibri"/>
-          <w:sz w:val="36"/>
-          <w:szCs w:val="36"/>
-        </w:rPr>
-      </w:pPr>
-    </w:p>
-    <w:p>
-      <w:pPr>
-        <w:jc w:val="both"/>
-        <w:rPr>
-          <w:rFonts w:ascii="Calibri" w:hAnsi="Calibri" w:cs="Calibri"/>
-          <w:sz w:val="36"/>
-          <w:szCs w:val="36"/>
-        </w:rPr>
-      </w:pPr>
-      <w:r>
-        <w:rPr>
-          <w:rFonts w:ascii="Calibri" w:hAnsi="Calibri" w:cs="Calibri"/>
-          <w:sz w:val="36"/>
-          <w:szCs w:val="36"/>
+          <w:sz w:val="34"/>
+          <w:szCs w:val="34"/>
+        </w:rPr>
+      </w:pPr>
+    </w:p>
+    <w:p>
+      <w:pPr>
+        <w:jc w:val="both"/>
+        <w:rPr>
+          <w:rFonts w:ascii="Calibri" w:hAnsi="Calibri" w:cs="Calibri"/>
+          <w:sz w:val="34"/>
+          <w:szCs w:val="34"/>
+        </w:rPr>
+      </w:pPr>
+      <w:r>
+        <w:rPr>
+          <w:rFonts w:ascii="Calibri" w:hAnsi="Calibri" w:cs="Calibri"/>
+          <w:sz w:val="34"/>
+          <w:szCs w:val="34"/>
         </w:rPr>
         <w:t>Advanced, Add Memory to Chat Bot:</w:t>
       </w:r>
@@ -1937,16 +1938,17 @@
         <w:jc w:val="both"/>
         <w:rPr>
           <w:rFonts w:ascii="Calibri" w:hAnsi="Calibri" w:cs="Calibri"/>
-          <w:sz w:val="36"/>
-          <w:szCs w:val="36"/>
-        </w:rPr>
-      </w:pPr>
-      <w:r>
-        <w:rPr>
-          <w:rFonts w:ascii="Calibri" w:hAnsi="Calibri" w:cs="Calibri"/>
-          <w:sz w:val="36"/>
-          <w:szCs w:val="36"/>
-        </w:rPr>
+          <w:sz w:val="34"/>
+          <w:szCs w:val="34"/>
+        </w:rPr>
+      </w:pPr>
+      <w:r>
+        <w:rPr>
+          <w:rFonts w:ascii="Calibri" w:hAnsi="Calibri" w:cs="Calibri"/>
+          <w:sz w:val="34"/>
+          <w:szCs w:val="34"/>
+        </w:rPr>
+        <w:lastRenderedPageBreak/>
         <w:t># If send a message to the chat specifying our name and then ask it again what’s my name it won’t be able to tell our name because it doesn’t have memory.</w:t>
       </w:r>
     </w:p>
@@ -1955,15 +1957,15 @@
         <w:jc w:val="both"/>
         <w:rPr>
           <w:rFonts w:ascii="Calibri" w:hAnsi="Calibri" w:cs="Calibri"/>
-          <w:sz w:val="36"/>
-          <w:szCs w:val="36"/>
-        </w:rPr>
-      </w:pPr>
-      <w:r>
-        <w:rPr>
-          <w:rFonts w:ascii="Calibri" w:hAnsi="Calibri" w:cs="Calibri"/>
-          <w:sz w:val="36"/>
-          <w:szCs w:val="36"/>
+          <w:sz w:val="34"/>
+          <w:szCs w:val="34"/>
+        </w:rPr>
+      </w:pPr>
+      <w:r>
+        <w:rPr>
+          <w:rFonts w:ascii="Calibri" w:hAnsi="Calibri" w:cs="Calibri"/>
+          <w:sz w:val="34"/>
+          <w:szCs w:val="34"/>
         </w:rPr>
         <w:t># To add memory just simply click on “</w:t>
       </w:r>
@@ -1972,16 +1974,16 @@
           <w:rFonts w:ascii="Calibri" w:hAnsi="Calibri" w:cs="Calibri"/>
           <w:b/>
           <w:bCs/>
-          <w:sz w:val="36"/>
-          <w:szCs w:val="36"/>
+          <w:sz w:val="34"/>
+          <w:szCs w:val="34"/>
         </w:rPr>
         <w:t>+</w:t>
       </w:r>
       <w:r>
         <w:rPr>
           <w:rFonts w:ascii="Calibri" w:hAnsi="Calibri" w:cs="Calibri"/>
-          <w:sz w:val="36"/>
-          <w:szCs w:val="36"/>
+          <w:sz w:val="34"/>
+          <w:szCs w:val="34"/>
         </w:rPr>
         <w:t xml:space="preserve">” memory icon of </w:t>
       </w:r>
@@ -1990,16 +1992,16 @@
           <w:rFonts w:ascii="Calibri" w:hAnsi="Calibri" w:cs="Calibri"/>
           <w:b/>
           <w:bCs/>
-          <w:sz w:val="36"/>
-          <w:szCs w:val="36"/>
+          <w:sz w:val="34"/>
+          <w:szCs w:val="34"/>
         </w:rPr>
         <w:t>AI-Agent</w:t>
       </w:r>
       <w:r>
         <w:rPr>
           <w:rFonts w:ascii="Calibri" w:hAnsi="Calibri" w:cs="Calibri"/>
-          <w:sz w:val="36"/>
-          <w:szCs w:val="36"/>
+          <w:sz w:val="34"/>
+          <w:szCs w:val="34"/>
         </w:rPr>
         <w:t>. We have multiple options for memory like databases:</w:t>
       </w:r>
@@ -2014,15 +2016,15 @@
         <w:jc w:val="both"/>
         <w:rPr>
           <w:rFonts w:ascii="Calibri" w:hAnsi="Calibri" w:cs="Calibri"/>
-          <w:sz w:val="36"/>
-          <w:szCs w:val="36"/>
-        </w:rPr>
-      </w:pPr>
-      <w:r>
-        <w:rPr>
-          <w:rFonts w:ascii="Calibri" w:hAnsi="Calibri" w:cs="Calibri"/>
-          <w:sz w:val="36"/>
-          <w:szCs w:val="36"/>
+          <w:sz w:val="34"/>
+          <w:szCs w:val="34"/>
+        </w:rPr>
+      </w:pPr>
+      <w:r>
+        <w:rPr>
+          <w:rFonts w:ascii="Calibri" w:hAnsi="Calibri" w:cs="Calibri"/>
+          <w:sz w:val="34"/>
+          <w:szCs w:val="34"/>
         </w:rPr>
         <w:t>MongoDB</w:t>
       </w:r>
@@ -2037,15 +2039,15 @@
         <w:jc w:val="both"/>
         <w:rPr>
           <w:rFonts w:ascii="Calibri" w:hAnsi="Calibri" w:cs="Calibri"/>
-          <w:sz w:val="36"/>
-          <w:szCs w:val="36"/>
-        </w:rPr>
-      </w:pPr>
-      <w:r>
-        <w:rPr>
-          <w:rFonts w:ascii="Calibri" w:hAnsi="Calibri" w:cs="Calibri"/>
-          <w:sz w:val="36"/>
-          <w:szCs w:val="36"/>
+          <w:sz w:val="34"/>
+          <w:szCs w:val="34"/>
+        </w:rPr>
+      </w:pPr>
+      <w:r>
+        <w:rPr>
+          <w:rFonts w:ascii="Calibri" w:hAnsi="Calibri" w:cs="Calibri"/>
+          <w:sz w:val="34"/>
+          <w:szCs w:val="34"/>
         </w:rPr>
         <w:t>Postgres</w:t>
       </w:r>
@@ -2060,15 +2062,15 @@
         <w:jc w:val="both"/>
         <w:rPr>
           <w:rFonts w:ascii="Calibri" w:hAnsi="Calibri" w:cs="Calibri"/>
-          <w:sz w:val="36"/>
-          <w:szCs w:val="36"/>
-        </w:rPr>
-      </w:pPr>
-      <w:r>
-        <w:rPr>
-          <w:rFonts w:ascii="Calibri" w:hAnsi="Calibri" w:cs="Calibri"/>
-          <w:sz w:val="36"/>
-          <w:szCs w:val="36"/>
+          <w:sz w:val="34"/>
+          <w:szCs w:val="34"/>
+        </w:rPr>
+      </w:pPr>
+      <w:r>
+        <w:rPr>
+          <w:rFonts w:ascii="Calibri" w:hAnsi="Calibri" w:cs="Calibri"/>
+          <w:sz w:val="34"/>
+          <w:szCs w:val="34"/>
         </w:rPr>
         <w:t>Redis</w:t>
       </w:r>
@@ -2083,15 +2085,15 @@
         <w:jc w:val="both"/>
         <w:rPr>
           <w:rFonts w:ascii="Calibri" w:hAnsi="Calibri" w:cs="Calibri"/>
-          <w:sz w:val="36"/>
-          <w:szCs w:val="36"/>
-        </w:rPr>
-      </w:pPr>
-      <w:r>
-        <w:rPr>
-          <w:rFonts w:ascii="Calibri" w:hAnsi="Calibri" w:cs="Calibri"/>
-          <w:sz w:val="36"/>
-          <w:szCs w:val="36"/>
+          <w:sz w:val="34"/>
+          <w:szCs w:val="34"/>
+        </w:rPr>
+      </w:pPr>
+      <w:r>
+        <w:rPr>
+          <w:rFonts w:ascii="Calibri" w:hAnsi="Calibri" w:cs="Calibri"/>
+          <w:sz w:val="34"/>
+          <w:szCs w:val="34"/>
         </w:rPr>
         <w:t>Xata</w:t>
       </w:r>
@@ -2101,15 +2103,15 @@
         <w:jc w:val="both"/>
         <w:rPr>
           <w:rFonts w:ascii="Calibri" w:hAnsi="Calibri" w:cs="Calibri"/>
-          <w:sz w:val="36"/>
-          <w:szCs w:val="36"/>
-        </w:rPr>
-      </w:pPr>
-      <w:r>
-        <w:rPr>
-          <w:rFonts w:ascii="Calibri" w:hAnsi="Calibri" w:cs="Calibri"/>
-          <w:sz w:val="36"/>
-          <w:szCs w:val="36"/>
+          <w:sz w:val="34"/>
+          <w:szCs w:val="34"/>
+        </w:rPr>
+      </w:pPr>
+      <w:r>
+        <w:rPr>
+          <w:rFonts w:ascii="Calibri" w:hAnsi="Calibri" w:cs="Calibri"/>
+          <w:sz w:val="34"/>
+          <w:szCs w:val="34"/>
         </w:rPr>
         <w:t xml:space="preserve"># But we’ll select </w:t>
       </w:r>
@@ -2118,16 +2120,16 @@
           <w:rFonts w:ascii="Calibri" w:hAnsi="Calibri" w:cs="Calibri"/>
           <w:b/>
           <w:bCs/>
-          <w:sz w:val="36"/>
-          <w:szCs w:val="36"/>
+          <w:sz w:val="34"/>
+          <w:szCs w:val="34"/>
         </w:rPr>
         <w:t>Simple Memory</w:t>
       </w:r>
       <w:r>
         <w:rPr>
           <w:rFonts w:ascii="Calibri" w:hAnsi="Calibri" w:cs="Calibri"/>
-          <w:sz w:val="36"/>
-          <w:szCs w:val="36"/>
+          <w:sz w:val="34"/>
+          <w:szCs w:val="34"/>
         </w:rPr>
         <w:t xml:space="preserve"> (stores in n8n memory, so no credential required)</w:t>
       </w:r>
@@ -2137,15 +2139,15 @@
         <w:jc w:val="both"/>
         <w:rPr>
           <w:rFonts w:ascii="Calibri" w:hAnsi="Calibri" w:cs="Calibri"/>
-          <w:sz w:val="36"/>
-          <w:szCs w:val="36"/>
-        </w:rPr>
-      </w:pPr>
-      <w:r>
-        <w:rPr>
-          <w:rFonts w:ascii="Calibri" w:hAnsi="Calibri" w:cs="Calibri"/>
-          <w:sz w:val="36"/>
-          <w:szCs w:val="36"/>
+          <w:sz w:val="34"/>
+          <w:szCs w:val="34"/>
+        </w:rPr>
+      </w:pPr>
+      <w:r>
+        <w:rPr>
+          <w:rFonts w:ascii="Calibri" w:hAnsi="Calibri" w:cs="Calibri"/>
+          <w:sz w:val="34"/>
+          <w:szCs w:val="34"/>
         </w:rPr>
         <w:t># After connecting it. Set context window length to 5 or 10 (number of past messages to store). Now it can remember our name</w:t>
       </w:r>
@@ -2155,39 +2157,39 @@
         <w:jc w:val="both"/>
         <w:rPr>
           <w:rFonts w:ascii="Calibri" w:hAnsi="Calibri" w:cs="Calibri"/>
-          <w:sz w:val="36"/>
-          <w:szCs w:val="36"/>
-        </w:rPr>
-      </w:pPr>
-    </w:p>
-    <w:p>
-      <w:pPr>
-        <w:jc w:val="both"/>
-        <w:rPr>
-          <w:rFonts w:ascii="Calibri" w:hAnsi="Calibri" w:cs="Calibri"/>
-          <w:sz w:val="36"/>
-          <w:szCs w:val="36"/>
-        </w:rPr>
-      </w:pPr>
-    </w:p>
-    <w:p>
-      <w:pPr>
-        <w:jc w:val="both"/>
-        <w:rPr>
-          <w:rFonts w:ascii="Calibri" w:hAnsi="Calibri" w:cs="Calibri"/>
-          <w:b/>
-          <w:bCs/>
-          <w:sz w:val="36"/>
-          <w:szCs w:val="36"/>
-        </w:rPr>
-      </w:pPr>
-      <w:r>
-        <w:rPr>
-          <w:rFonts w:ascii="Calibri" w:hAnsi="Calibri" w:cs="Calibri"/>
-          <w:b/>
-          <w:bCs/>
-          <w:sz w:val="36"/>
-          <w:szCs w:val="36"/>
+          <w:sz w:val="34"/>
+          <w:szCs w:val="34"/>
+        </w:rPr>
+      </w:pPr>
+    </w:p>
+    <w:p>
+      <w:pPr>
+        <w:jc w:val="both"/>
+        <w:rPr>
+          <w:rFonts w:ascii="Calibri" w:hAnsi="Calibri" w:cs="Calibri"/>
+          <w:sz w:val="34"/>
+          <w:szCs w:val="34"/>
+        </w:rPr>
+      </w:pPr>
+    </w:p>
+    <w:p>
+      <w:pPr>
+        <w:jc w:val="both"/>
+        <w:rPr>
+          <w:rFonts w:ascii="Calibri" w:hAnsi="Calibri" w:cs="Calibri"/>
+          <w:b/>
+          <w:bCs/>
+          <w:sz w:val="34"/>
+          <w:szCs w:val="34"/>
+        </w:rPr>
+      </w:pPr>
+      <w:r>
+        <w:rPr>
+          <w:rFonts w:ascii="Calibri" w:hAnsi="Calibri" w:cs="Calibri"/>
+          <w:b/>
+          <w:bCs/>
+          <w:sz w:val="34"/>
+          <w:szCs w:val="34"/>
         </w:rPr>
         <w:t>Creating An Email Agent:</w:t>
       </w:r>
@@ -2197,47 +2199,47 @@
         <w:jc w:val="both"/>
         <w:rPr>
           <w:rFonts w:ascii="Calibri" w:hAnsi="Calibri" w:cs="Calibri"/>
-          <w:sz w:val="36"/>
-          <w:szCs w:val="36"/>
-        </w:rPr>
-      </w:pPr>
-      <w:r>
-        <w:rPr>
-          <w:rFonts w:ascii="Calibri" w:hAnsi="Calibri" w:cs="Calibri"/>
-          <w:sz w:val="36"/>
-          <w:szCs w:val="36"/>
+          <w:sz w:val="34"/>
+          <w:szCs w:val="34"/>
+        </w:rPr>
+      </w:pPr>
+      <w:r>
+        <w:rPr>
+          <w:rFonts w:ascii="Calibri" w:hAnsi="Calibri" w:cs="Calibri"/>
+          <w:sz w:val="34"/>
+          <w:szCs w:val="34"/>
         </w:rPr>
         <w:t xml:space="preserve"># Copy </w:t>
       </w:r>
       <w:r>
         <w:rPr>
           <w:rFonts w:ascii="Calibri" w:hAnsi="Calibri" w:cs="Calibri"/>
-          <w:sz w:val="36"/>
-          <w:szCs w:val="36"/>
+          <w:sz w:val="34"/>
+          <w:szCs w:val="34"/>
         </w:rPr>
         <w:t>pastes</w:t>
       </w:r>
       <w:r>
         <w:rPr>
           <w:rFonts w:ascii="Calibri" w:hAnsi="Calibri" w:cs="Calibri"/>
-          <w:sz w:val="36"/>
-          <w:szCs w:val="36"/>
+          <w:sz w:val="34"/>
+          <w:szCs w:val="34"/>
         </w:rPr>
         <w:t xml:space="preserve"> the same thing in Email Agent. The</w:t>
       </w:r>
       <w:r>
         <w:rPr>
           <w:rFonts w:ascii="Calibri" w:hAnsi="Calibri" w:cs="Calibri"/>
-          <w:sz w:val="36"/>
-          <w:szCs w:val="36"/>
+          <w:sz w:val="34"/>
+          <w:szCs w:val="34"/>
         </w:rPr>
         <w:t xml:space="preserve"> same</w:t>
       </w:r>
       <w:r>
         <w:rPr>
           <w:rFonts w:ascii="Calibri" w:hAnsi="Calibri" w:cs="Calibri"/>
-          <w:sz w:val="36"/>
-          <w:szCs w:val="36"/>
+          <w:sz w:val="34"/>
+          <w:szCs w:val="34"/>
         </w:rPr>
         <w:t>:</w:t>
       </w:r>
@@ -2252,15 +2254,15 @@
         <w:jc w:val="both"/>
         <w:rPr>
           <w:rFonts w:ascii="Calibri" w:hAnsi="Calibri" w:cs="Calibri"/>
-          <w:sz w:val="36"/>
-          <w:szCs w:val="36"/>
-        </w:rPr>
-      </w:pPr>
-      <w:r>
-        <w:rPr>
-          <w:rFonts w:ascii="Calibri" w:hAnsi="Calibri" w:cs="Calibri"/>
-          <w:sz w:val="36"/>
-          <w:szCs w:val="36"/>
+          <w:sz w:val="34"/>
+          <w:szCs w:val="34"/>
+        </w:rPr>
+      </w:pPr>
+      <w:r>
+        <w:rPr>
+          <w:rFonts w:ascii="Calibri" w:hAnsi="Calibri" w:cs="Calibri"/>
+          <w:sz w:val="34"/>
+          <w:szCs w:val="34"/>
         </w:rPr>
         <w:t>AI-Agent</w:t>
       </w:r>
@@ -2275,15 +2277,15 @@
         <w:jc w:val="both"/>
         <w:rPr>
           <w:rFonts w:ascii="Calibri" w:hAnsi="Calibri" w:cs="Calibri"/>
-          <w:sz w:val="36"/>
-          <w:szCs w:val="36"/>
-        </w:rPr>
-      </w:pPr>
-      <w:r>
-        <w:rPr>
-          <w:rFonts w:ascii="Calibri" w:hAnsi="Calibri" w:cs="Calibri"/>
-          <w:sz w:val="36"/>
-          <w:szCs w:val="36"/>
+          <w:sz w:val="34"/>
+          <w:szCs w:val="34"/>
+        </w:rPr>
+      </w:pPr>
+      <w:r>
+        <w:rPr>
+          <w:rFonts w:ascii="Calibri" w:hAnsi="Calibri" w:cs="Calibri"/>
+          <w:sz w:val="34"/>
+          <w:szCs w:val="34"/>
         </w:rPr>
         <w:t>Chat Model (</w:t>
       </w:r>
@@ -2292,24 +2294,24 @@
           <w:rFonts w:ascii="Calibri" w:hAnsi="Calibri" w:cs="Calibri"/>
           <w:b/>
           <w:bCs/>
-          <w:sz w:val="36"/>
-          <w:szCs w:val="36"/>
+          <w:sz w:val="34"/>
+          <w:szCs w:val="34"/>
         </w:rPr>
         <w:t>Groq</w:t>
       </w:r>
       <w:r>
         <w:rPr>
           <w:rFonts w:ascii="Calibri" w:hAnsi="Calibri" w:cs="Calibri"/>
-          <w:sz w:val="36"/>
-          <w:szCs w:val="36"/>
+          <w:sz w:val="34"/>
+          <w:szCs w:val="34"/>
         </w:rPr>
         <w:t>’s model,</w:t>
       </w:r>
       <w:r>
         <w:rPr>
           <w:rFonts w:ascii="Calibri" w:hAnsi="Calibri" w:cs="Calibri"/>
-          <w:sz w:val="36"/>
-          <w:szCs w:val="36"/>
+          <w:sz w:val="34"/>
+          <w:szCs w:val="34"/>
         </w:rPr>
         <w:t xml:space="preserve"> </w:t>
       </w:r>
@@ -2318,8 +2320,8 @@
           <w:rFonts w:ascii="Calibri" w:hAnsi="Calibri" w:cs="Calibri"/>
           <w:b/>
           <w:bCs/>
-          <w:sz w:val="36"/>
-          <w:szCs w:val="36"/>
+          <w:sz w:val="34"/>
+          <w:szCs w:val="34"/>
         </w:rPr>
         <w:t>meta-llama</w:t>
       </w:r>
@@ -2328,16 +2330,16 @@
           <w:rFonts w:ascii="Calibri" w:hAnsi="Calibri" w:cs="Calibri"/>
           <w:b/>
           <w:bCs/>
-          <w:sz w:val="36"/>
-          <w:szCs w:val="36"/>
+          <w:sz w:val="34"/>
+          <w:szCs w:val="34"/>
         </w:rPr>
         <w:t>/..17b-16e-instruct</w:t>
       </w:r>
       <w:r>
         <w:rPr>
           <w:rFonts w:ascii="Calibri" w:hAnsi="Calibri" w:cs="Calibri"/>
-          <w:sz w:val="36"/>
-          <w:szCs w:val="36"/>
+          <w:sz w:val="34"/>
+          <w:szCs w:val="34"/>
         </w:rPr>
         <w:t>)</w:t>
       </w:r>
@@ -2352,15 +2354,15 @@
         <w:jc w:val="both"/>
         <w:rPr>
           <w:rFonts w:ascii="Calibri" w:hAnsi="Calibri" w:cs="Calibri"/>
-          <w:sz w:val="36"/>
-          <w:szCs w:val="36"/>
-        </w:rPr>
-      </w:pPr>
-      <w:r>
-        <w:rPr>
-          <w:rFonts w:ascii="Calibri" w:hAnsi="Calibri" w:cs="Calibri"/>
-          <w:sz w:val="36"/>
-          <w:szCs w:val="36"/>
+          <w:sz w:val="34"/>
+          <w:szCs w:val="34"/>
+        </w:rPr>
+      </w:pPr>
+      <w:r>
+        <w:rPr>
+          <w:rFonts w:ascii="Calibri" w:hAnsi="Calibri" w:cs="Calibri"/>
+          <w:sz w:val="34"/>
+          <w:szCs w:val="34"/>
         </w:rPr>
         <w:t>Simple Memory</w:t>
       </w:r>
@@ -2370,45 +2372,45 @@
         <w:jc w:val="both"/>
         <w:rPr>
           <w:rFonts w:ascii="Calibri" w:hAnsi="Calibri" w:cs="Calibri"/>
-          <w:sz w:val="36"/>
-          <w:szCs w:val="36"/>
-        </w:rPr>
-      </w:pPr>
-      <w:r>
-        <w:rPr>
-          <w:rFonts w:ascii="Calibri" w:hAnsi="Calibri" w:cs="Calibri"/>
-          <w:sz w:val="36"/>
-          <w:szCs w:val="36"/>
+          <w:sz w:val="34"/>
+          <w:szCs w:val="34"/>
+        </w:rPr>
+      </w:pPr>
+      <w:r>
+        <w:rPr>
+          <w:rFonts w:ascii="Calibri" w:hAnsi="Calibri" w:cs="Calibri"/>
+          <w:sz w:val="34"/>
+          <w:szCs w:val="34"/>
+        </w:rPr>
+        <w:t># But trigger is different. Instead of On Chat Received we use Gmail Trigger</w:t>
+      </w:r>
+    </w:p>
+    <w:p>
+      <w:pPr>
+        <w:jc w:val="both"/>
+        <w:rPr>
+          <w:rFonts w:ascii="Calibri" w:hAnsi="Calibri" w:cs="Calibri"/>
+          <w:sz w:val="34"/>
+          <w:szCs w:val="34"/>
+        </w:rPr>
+      </w:pPr>
+    </w:p>
+    <w:p>
+      <w:pPr>
+        <w:jc w:val="both"/>
+        <w:rPr>
+          <w:rFonts w:ascii="Calibri" w:hAnsi="Calibri" w:cs="Calibri"/>
+          <w:sz w:val="34"/>
+          <w:szCs w:val="34"/>
+        </w:rPr>
+      </w:pPr>
+      <w:r>
+        <w:rPr>
+          <w:rFonts w:ascii="Calibri" w:hAnsi="Calibri" w:cs="Calibri"/>
+          <w:sz w:val="34"/>
+          <w:szCs w:val="34"/>
         </w:rPr>
         <w:lastRenderedPageBreak/>
-        <w:t># But trigger is different. Instead of On Chat Received we use Gmail Trigger</w:t>
-      </w:r>
-    </w:p>
-    <w:p>
-      <w:pPr>
-        <w:jc w:val="both"/>
-        <w:rPr>
-          <w:rFonts w:ascii="Calibri" w:hAnsi="Calibri" w:cs="Calibri"/>
-          <w:sz w:val="36"/>
-          <w:szCs w:val="36"/>
-        </w:rPr>
-      </w:pPr>
-    </w:p>
-    <w:p>
-      <w:pPr>
-        <w:jc w:val="both"/>
-        <w:rPr>
-          <w:rFonts w:ascii="Calibri" w:hAnsi="Calibri" w:cs="Calibri"/>
-          <w:sz w:val="36"/>
-          <w:szCs w:val="36"/>
-        </w:rPr>
-      </w:pPr>
-      <w:r>
-        <w:rPr>
-          <w:rFonts w:ascii="Calibri" w:hAnsi="Calibri" w:cs="Calibri"/>
-          <w:sz w:val="36"/>
-          <w:szCs w:val="36"/>
-        </w:rPr>
         <w:t>Step-1 Set Gmail:</w:t>
       </w:r>
     </w:p>
@@ -2417,15 +2419,15 @@
         <w:jc w:val="both"/>
         <w:rPr>
           <w:rFonts w:ascii="Calibri" w:hAnsi="Calibri" w:cs="Calibri"/>
-          <w:sz w:val="36"/>
-          <w:szCs w:val="36"/>
-        </w:rPr>
-      </w:pPr>
-      <w:r>
-        <w:rPr>
-          <w:rFonts w:ascii="Calibri" w:hAnsi="Calibri" w:cs="Calibri"/>
-          <w:sz w:val="36"/>
-          <w:szCs w:val="36"/>
+          <w:sz w:val="34"/>
+          <w:szCs w:val="34"/>
+        </w:rPr>
+      </w:pPr>
+      <w:r>
+        <w:rPr>
+          <w:rFonts w:ascii="Calibri" w:hAnsi="Calibri" w:cs="Calibri"/>
+          <w:sz w:val="34"/>
+          <w:szCs w:val="34"/>
         </w:rPr>
         <w:t xml:space="preserve"># Search for Gmail Trigger and connect it to left side of </w:t>
       </w:r>
@@ -2434,16 +2436,16 @@
           <w:rFonts w:ascii="Calibri" w:hAnsi="Calibri" w:cs="Calibri"/>
           <w:b/>
           <w:bCs/>
-          <w:sz w:val="36"/>
-          <w:szCs w:val="36"/>
+          <w:sz w:val="34"/>
+          <w:szCs w:val="34"/>
         </w:rPr>
         <w:t>AI-Agent</w:t>
       </w:r>
       <w:r>
         <w:rPr>
           <w:rFonts w:ascii="Calibri" w:hAnsi="Calibri" w:cs="Calibri"/>
-          <w:sz w:val="36"/>
-          <w:szCs w:val="36"/>
+          <w:sz w:val="34"/>
+          <w:szCs w:val="34"/>
         </w:rPr>
         <w:t>. Then in credential sign in to Gmail account</w:t>
       </w:r>
@@ -2453,15 +2455,15 @@
         <w:jc w:val="both"/>
         <w:rPr>
           <w:rFonts w:ascii="Calibri" w:hAnsi="Calibri" w:cs="Calibri"/>
-          <w:sz w:val="36"/>
-          <w:szCs w:val="36"/>
-        </w:rPr>
-      </w:pPr>
-      <w:r>
-        <w:rPr>
-          <w:rFonts w:ascii="Calibri" w:hAnsi="Calibri" w:cs="Calibri"/>
-          <w:sz w:val="36"/>
-          <w:szCs w:val="36"/>
+          <w:sz w:val="34"/>
+          <w:szCs w:val="34"/>
+        </w:rPr>
+      </w:pPr>
+      <w:r>
+        <w:rPr>
+          <w:rFonts w:ascii="Calibri" w:hAnsi="Calibri" w:cs="Calibri"/>
+          <w:sz w:val="34"/>
+          <w:szCs w:val="34"/>
         </w:rPr>
         <w:t># We can select mode and max emails per Poll. Then send an email to our account and click on</w:t>
       </w:r>
@@ -2470,16 +2472,16 @@
           <w:rFonts w:ascii="Calibri" w:hAnsi="Calibri" w:cs="Calibri"/>
           <w:b/>
           <w:bCs/>
-          <w:sz w:val="36"/>
-          <w:szCs w:val="36"/>
+          <w:sz w:val="34"/>
+          <w:szCs w:val="34"/>
         </w:rPr>
         <w:t xml:space="preserve"> Fetch Test Event</w:t>
       </w:r>
       <w:r>
         <w:rPr>
           <w:rFonts w:ascii="Calibri" w:hAnsi="Calibri" w:cs="Calibri"/>
-          <w:sz w:val="36"/>
-          <w:szCs w:val="36"/>
+          <w:sz w:val="34"/>
+          <w:szCs w:val="34"/>
         </w:rPr>
         <w:t>. Our sent email will be fetched on the trigger</w:t>
       </w:r>
@@ -2489,15 +2491,15 @@
         <w:jc w:val="both"/>
         <w:rPr>
           <w:rFonts w:ascii="Calibri" w:hAnsi="Calibri" w:cs="Calibri"/>
-          <w:sz w:val="36"/>
-          <w:szCs w:val="36"/>
-        </w:rPr>
-      </w:pPr>
-      <w:r>
-        <w:rPr>
-          <w:rFonts w:ascii="Calibri" w:hAnsi="Calibri" w:cs="Calibri"/>
-          <w:sz w:val="36"/>
-          <w:szCs w:val="36"/>
+          <w:sz w:val="34"/>
+          <w:szCs w:val="34"/>
+        </w:rPr>
+      </w:pPr>
+      <w:r>
+        <w:rPr>
+          <w:rFonts w:ascii="Calibri" w:hAnsi="Calibri" w:cs="Calibri"/>
+          <w:sz w:val="34"/>
+          <w:szCs w:val="34"/>
         </w:rPr>
         <w:t xml:space="preserve"># In the </w:t>
       </w:r>
@@ -2506,16 +2508,16 @@
           <w:rFonts w:ascii="Calibri" w:hAnsi="Calibri" w:cs="Calibri"/>
           <w:b/>
           <w:bCs/>
-          <w:sz w:val="36"/>
-          <w:szCs w:val="36"/>
+          <w:sz w:val="34"/>
+          <w:szCs w:val="34"/>
         </w:rPr>
         <w:t>Filters</w:t>
       </w:r>
       <w:r>
         <w:rPr>
           <w:rFonts w:ascii="Calibri" w:hAnsi="Calibri" w:cs="Calibri"/>
-          <w:sz w:val="36"/>
-          <w:szCs w:val="36"/>
+          <w:sz w:val="34"/>
+          <w:szCs w:val="34"/>
         </w:rPr>
         <w:t xml:space="preserve"> section, we can add filters like </w:t>
       </w:r>
@@ -2524,16 +2526,16 @@
           <w:rFonts w:ascii="Calibri" w:hAnsi="Calibri" w:cs="Calibri"/>
           <w:b/>
           <w:bCs/>
-          <w:sz w:val="36"/>
-          <w:szCs w:val="36"/>
+          <w:sz w:val="34"/>
+          <w:szCs w:val="34"/>
         </w:rPr>
         <w:t>Read Status</w:t>
       </w:r>
       <w:r>
         <w:rPr>
           <w:rFonts w:ascii="Calibri" w:hAnsi="Calibri" w:cs="Calibri"/>
-          <w:sz w:val="36"/>
-          <w:szCs w:val="36"/>
+          <w:sz w:val="34"/>
+          <w:szCs w:val="34"/>
         </w:rPr>
         <w:t xml:space="preserve"> to fetch unread emails only (which will be replied to)</w:t>
       </w:r>
@@ -2543,25 +2545,25 @@
         <w:jc w:val="both"/>
         <w:rPr>
           <w:rFonts w:ascii="Calibri" w:hAnsi="Calibri" w:cs="Calibri"/>
-          <w:sz w:val="36"/>
-          <w:szCs w:val="36"/>
-        </w:rPr>
-      </w:pPr>
-    </w:p>
-    <w:p>
-      <w:pPr>
-        <w:jc w:val="both"/>
-        <w:rPr>
-          <w:rFonts w:ascii="Calibri" w:hAnsi="Calibri" w:cs="Calibri"/>
-          <w:sz w:val="36"/>
-          <w:szCs w:val="36"/>
-        </w:rPr>
-      </w:pPr>
-      <w:r>
-        <w:rPr>
-          <w:rFonts w:ascii="Calibri" w:hAnsi="Calibri" w:cs="Calibri"/>
-          <w:sz w:val="36"/>
-          <w:szCs w:val="36"/>
+          <w:sz w:val="34"/>
+          <w:szCs w:val="34"/>
+        </w:rPr>
+      </w:pPr>
+    </w:p>
+    <w:p>
+      <w:pPr>
+        <w:jc w:val="both"/>
+        <w:rPr>
+          <w:rFonts w:ascii="Calibri" w:hAnsi="Calibri" w:cs="Calibri"/>
+          <w:sz w:val="34"/>
+          <w:szCs w:val="34"/>
+        </w:rPr>
+      </w:pPr>
+      <w:r>
+        <w:rPr>
+          <w:rFonts w:ascii="Calibri" w:hAnsi="Calibri" w:cs="Calibri"/>
+          <w:sz w:val="34"/>
+          <w:szCs w:val="34"/>
         </w:rPr>
         <w:t>Step-2, Set prompt in AI-Agent:</w:t>
       </w:r>
@@ -2571,15 +2573,15 @@
         <w:jc w:val="both"/>
         <w:rPr>
           <w:rFonts w:ascii="Calibri" w:hAnsi="Calibri" w:cs="Calibri"/>
-          <w:sz w:val="36"/>
-          <w:szCs w:val="36"/>
-        </w:rPr>
-      </w:pPr>
-      <w:r>
-        <w:rPr>
-          <w:rFonts w:ascii="Calibri" w:hAnsi="Calibri" w:cs="Calibri"/>
-          <w:sz w:val="36"/>
-          <w:szCs w:val="36"/>
+          <w:sz w:val="34"/>
+          <w:szCs w:val="34"/>
+        </w:rPr>
+      </w:pPr>
+      <w:r>
+        <w:rPr>
+          <w:rFonts w:ascii="Calibri" w:hAnsi="Calibri" w:cs="Calibri"/>
+          <w:sz w:val="34"/>
+          <w:szCs w:val="34"/>
         </w:rPr>
         <w:t xml:space="preserve"># In </w:t>
       </w:r>
@@ -2588,16 +2590,16 @@
           <w:rFonts w:ascii="Calibri" w:hAnsi="Calibri" w:cs="Calibri"/>
           <w:b/>
           <w:bCs/>
-          <w:sz w:val="36"/>
-          <w:szCs w:val="36"/>
+          <w:sz w:val="34"/>
+          <w:szCs w:val="34"/>
         </w:rPr>
         <w:t>Source for Prompt</w:t>
       </w:r>
       <w:r>
         <w:rPr>
           <w:rFonts w:ascii="Calibri" w:hAnsi="Calibri" w:cs="Calibri"/>
-          <w:sz w:val="36"/>
-          <w:szCs w:val="36"/>
+          <w:sz w:val="34"/>
+          <w:szCs w:val="34"/>
         </w:rPr>
         <w:t xml:space="preserve">, select </w:t>
       </w:r>
@@ -2606,24 +2608,24 @@
           <w:rFonts w:ascii="Calibri" w:hAnsi="Calibri" w:cs="Calibri"/>
           <w:b/>
           <w:bCs/>
-          <w:sz w:val="36"/>
-          <w:szCs w:val="36"/>
+          <w:sz w:val="34"/>
+          <w:szCs w:val="34"/>
         </w:rPr>
         <w:t>define below</w:t>
       </w:r>
       <w:r>
         <w:rPr>
           <w:rFonts w:ascii="Calibri" w:hAnsi="Calibri" w:cs="Calibri"/>
-          <w:sz w:val="36"/>
-          <w:szCs w:val="36"/>
+          <w:sz w:val="34"/>
+          <w:szCs w:val="34"/>
         </w:rPr>
         <w:t xml:space="preserve">. Then specify our prompt and also from the left side drag and drop </w:t>
       </w:r>
       <w:r>
         <w:rPr>
           <w:rFonts w:ascii="Calibri" w:hAnsi="Calibri" w:cs="Calibri"/>
-          <w:sz w:val="36"/>
-          <w:szCs w:val="36"/>
+          <w:sz w:val="34"/>
+          <w:szCs w:val="34"/>
         </w:rPr>
         <w:t xml:space="preserve">email </w:t>
       </w:r>
@@ -2632,16 +2634,16 @@
           <w:rFonts w:ascii="Calibri" w:hAnsi="Calibri" w:cs="Calibri"/>
           <w:b/>
           <w:bCs/>
-          <w:sz w:val="36"/>
-          <w:szCs w:val="36"/>
+          <w:sz w:val="34"/>
+          <w:szCs w:val="34"/>
         </w:rPr>
         <w:t xml:space="preserve">id </w:t>
       </w:r>
       <w:r>
         <w:rPr>
           <w:rFonts w:ascii="Calibri" w:hAnsi="Calibri" w:cs="Calibri"/>
-          <w:sz w:val="36"/>
-          <w:szCs w:val="36"/>
+          <w:sz w:val="34"/>
+          <w:szCs w:val="34"/>
         </w:rPr>
         <w:t>at the end (we can also drop from, to, subject and payload or body of email)</w:t>
       </w:r>
@@ -2651,15 +2653,15 @@
         <w:jc w:val="both"/>
         <w:rPr>
           <w:rFonts w:ascii="Calibri" w:hAnsi="Calibri" w:cs="Calibri"/>
-          <w:sz w:val="36"/>
-          <w:szCs w:val="36"/>
-        </w:rPr>
-      </w:pPr>
-      <w:r>
-        <w:rPr>
-          <w:rFonts w:ascii="Calibri" w:hAnsi="Calibri" w:cs="Calibri"/>
-          <w:sz w:val="36"/>
-          <w:szCs w:val="36"/>
+          <w:sz w:val="34"/>
+          <w:szCs w:val="34"/>
+        </w:rPr>
+      </w:pPr>
+      <w:r>
+        <w:rPr>
+          <w:rFonts w:ascii="Calibri" w:hAnsi="Calibri" w:cs="Calibri"/>
+          <w:sz w:val="34"/>
+          <w:szCs w:val="34"/>
         </w:rPr>
         <w:t xml:space="preserve"># Then click </w:t>
       </w:r>
@@ -2668,16 +2670,16 @@
           <w:rFonts w:ascii="Calibri" w:hAnsi="Calibri" w:cs="Calibri"/>
           <w:b/>
           <w:bCs/>
-          <w:sz w:val="36"/>
-          <w:szCs w:val="36"/>
+          <w:sz w:val="34"/>
+          <w:szCs w:val="34"/>
         </w:rPr>
         <w:t xml:space="preserve">Execute Step </w:t>
       </w:r>
       <w:r>
         <w:rPr>
           <w:rFonts w:ascii="Calibri" w:hAnsi="Calibri" w:cs="Calibri"/>
-          <w:sz w:val="36"/>
-          <w:szCs w:val="36"/>
+          <w:sz w:val="34"/>
+          <w:szCs w:val="34"/>
         </w:rPr>
         <w:t>and we will get output on the right side</w:t>
       </w:r>
@@ -2687,25 +2689,25 @@
         <w:jc w:val="both"/>
         <w:rPr>
           <w:rFonts w:ascii="Calibri" w:hAnsi="Calibri" w:cs="Calibri"/>
-          <w:sz w:val="36"/>
-          <w:szCs w:val="36"/>
-        </w:rPr>
-      </w:pPr>
-    </w:p>
-    <w:p>
-      <w:pPr>
-        <w:jc w:val="both"/>
-        <w:rPr>
-          <w:rFonts w:ascii="Calibri" w:hAnsi="Calibri" w:cs="Calibri"/>
-          <w:sz w:val="36"/>
-          <w:szCs w:val="36"/>
-        </w:rPr>
-      </w:pPr>
-      <w:r>
-        <w:rPr>
-          <w:rFonts w:ascii="Calibri" w:hAnsi="Calibri" w:cs="Calibri"/>
-          <w:sz w:val="36"/>
-          <w:szCs w:val="36"/>
+          <w:sz w:val="34"/>
+          <w:szCs w:val="34"/>
+        </w:rPr>
+      </w:pPr>
+    </w:p>
+    <w:p>
+      <w:pPr>
+        <w:jc w:val="both"/>
+        <w:rPr>
+          <w:rFonts w:ascii="Calibri" w:hAnsi="Calibri" w:cs="Calibri"/>
+          <w:sz w:val="34"/>
+          <w:szCs w:val="34"/>
+        </w:rPr>
+      </w:pPr>
+      <w:r>
+        <w:rPr>
+          <w:rFonts w:ascii="Calibri" w:hAnsi="Calibri" w:cs="Calibri"/>
+          <w:sz w:val="34"/>
+          <w:szCs w:val="34"/>
         </w:rPr>
         <w:t>Step-3, Reply to Mail:</w:t>
       </w:r>
@@ -2715,15 +2717,15 @@
         <w:jc w:val="both"/>
         <w:rPr>
           <w:rFonts w:ascii="Calibri" w:hAnsi="Calibri" w:cs="Calibri"/>
-          <w:sz w:val="36"/>
-          <w:szCs w:val="36"/>
-        </w:rPr>
-      </w:pPr>
-      <w:r>
-        <w:rPr>
-          <w:rFonts w:ascii="Calibri" w:hAnsi="Calibri" w:cs="Calibri"/>
-          <w:sz w:val="36"/>
-          <w:szCs w:val="36"/>
+          <w:sz w:val="34"/>
+          <w:szCs w:val="34"/>
+        </w:rPr>
+      </w:pPr>
+      <w:r>
+        <w:rPr>
+          <w:rFonts w:ascii="Calibri" w:hAnsi="Calibri" w:cs="Calibri"/>
+          <w:sz w:val="34"/>
+          <w:szCs w:val="34"/>
         </w:rPr>
         <w:t xml:space="preserve"># Search Reply to a message (Gmail) and connect it to the right side of the </w:t>
       </w:r>
@@ -2732,8 +2734,8 @@
           <w:rFonts w:ascii="Calibri" w:hAnsi="Calibri" w:cs="Calibri"/>
           <w:b/>
           <w:bCs/>
-          <w:sz w:val="36"/>
-          <w:szCs w:val="36"/>
+          <w:sz w:val="34"/>
+          <w:szCs w:val="34"/>
         </w:rPr>
         <w:t>AI-Agent</w:t>
       </w:r>
@@ -2743,188 +2745,188 @@
         <w:jc w:val="both"/>
         <w:rPr>
           <w:rFonts w:ascii="Calibri" w:hAnsi="Calibri" w:cs="Calibri"/>
-          <w:sz w:val="36"/>
-          <w:szCs w:val="36"/>
-        </w:rPr>
-      </w:pPr>
-      <w:r>
-        <w:rPr>
-          <w:rFonts w:ascii="Calibri" w:hAnsi="Calibri" w:cs="Calibri"/>
-          <w:sz w:val="36"/>
-          <w:szCs w:val="36"/>
+          <w:sz w:val="34"/>
+          <w:szCs w:val="34"/>
+        </w:rPr>
+      </w:pPr>
+      <w:r>
+        <w:rPr>
+          <w:rFonts w:ascii="Calibri" w:hAnsi="Calibri" w:cs="Calibri"/>
+          <w:sz w:val="34"/>
+          <w:szCs w:val="34"/>
+        </w:rPr>
+        <w:t xml:space="preserve"># Sing in here, in the credential section. Then select </w:t>
+      </w:r>
+      <w:r>
+        <w:rPr>
+          <w:rFonts w:ascii="Calibri" w:hAnsi="Calibri" w:cs="Calibri"/>
+          <w:b/>
+          <w:bCs/>
+          <w:sz w:val="34"/>
+          <w:szCs w:val="34"/>
+        </w:rPr>
+        <w:t xml:space="preserve">Resource </w:t>
+      </w:r>
+      <w:r>
+        <w:rPr>
+          <w:rFonts w:ascii="Calibri" w:hAnsi="Calibri" w:cs="Calibri"/>
+          <w:sz w:val="34"/>
+          <w:szCs w:val="34"/>
+        </w:rPr>
+        <w:t>to</w:t>
+      </w:r>
+      <w:r>
+        <w:rPr>
+          <w:rFonts w:ascii="Calibri" w:hAnsi="Calibri" w:cs="Calibri"/>
+          <w:b/>
+          <w:bCs/>
+          <w:sz w:val="34"/>
+          <w:szCs w:val="34"/>
+        </w:rPr>
+        <w:t xml:space="preserve"> message</w:t>
+      </w:r>
+      <w:r>
+        <w:rPr>
+          <w:rFonts w:ascii="Calibri" w:hAnsi="Calibri" w:cs="Calibri"/>
+          <w:sz w:val="34"/>
+          <w:szCs w:val="34"/>
+        </w:rPr>
+        <w:t xml:space="preserve"> and </w:t>
+      </w:r>
+      <w:r>
+        <w:rPr>
+          <w:rFonts w:ascii="Calibri" w:hAnsi="Calibri" w:cs="Calibri"/>
+          <w:b/>
+          <w:bCs/>
+          <w:sz w:val="34"/>
+          <w:szCs w:val="34"/>
+        </w:rPr>
+        <w:t>Operation</w:t>
+      </w:r>
+      <w:r>
+        <w:rPr>
+          <w:rFonts w:ascii="Calibri" w:hAnsi="Calibri" w:cs="Calibri"/>
+          <w:sz w:val="34"/>
+          <w:szCs w:val="34"/>
+        </w:rPr>
+        <w:t xml:space="preserve"> to</w:t>
+      </w:r>
+      <w:r>
+        <w:rPr>
+          <w:rFonts w:ascii="Calibri" w:hAnsi="Calibri" w:cs="Calibri"/>
+          <w:b/>
+          <w:bCs/>
+          <w:sz w:val="34"/>
+          <w:szCs w:val="34"/>
+        </w:rPr>
+        <w:t xml:space="preserve"> reply</w:t>
+      </w:r>
+      <w:r>
+        <w:rPr>
+          <w:rFonts w:ascii="Calibri" w:hAnsi="Calibri" w:cs="Calibri"/>
+          <w:b/>
+          <w:bCs/>
+          <w:sz w:val="34"/>
+          <w:szCs w:val="34"/>
+        </w:rPr>
+        <w:t xml:space="preserve"> </w:t>
+      </w:r>
+      <w:r>
+        <w:rPr>
+          <w:rFonts w:ascii="Calibri" w:hAnsi="Calibri" w:cs="Calibri"/>
+          <w:sz w:val="34"/>
+          <w:szCs w:val="34"/>
+        </w:rPr>
+        <w:t>(we can also set a bunch of things here like send and wait for response)</w:t>
+      </w:r>
+    </w:p>
+    <w:p>
+      <w:pPr>
+        <w:jc w:val="both"/>
+        <w:rPr>
+          <w:rFonts w:ascii="Calibri" w:hAnsi="Calibri" w:cs="Calibri"/>
+          <w:sz w:val="34"/>
+          <w:szCs w:val="34"/>
+        </w:rPr>
+      </w:pPr>
+      <w:r>
+        <w:rPr>
+          <w:rFonts w:ascii="Calibri" w:hAnsi="Calibri" w:cs="Calibri"/>
+          <w:sz w:val="34"/>
+          <w:szCs w:val="34"/>
+        </w:rPr>
+        <w:t xml:space="preserve"># In the </w:t>
+      </w:r>
+      <w:r>
+        <w:rPr>
+          <w:rFonts w:ascii="Calibri" w:hAnsi="Calibri" w:cs="Calibri"/>
+          <w:b/>
+          <w:bCs/>
+          <w:sz w:val="34"/>
+          <w:szCs w:val="34"/>
+        </w:rPr>
+        <w:t>message</w:t>
+      </w:r>
+      <w:r>
+        <w:rPr>
+          <w:rFonts w:ascii="Calibri" w:hAnsi="Calibri" w:cs="Calibri"/>
+          <w:sz w:val="34"/>
+          <w:szCs w:val="34"/>
+        </w:rPr>
+        <w:t xml:space="preserve"> </w:t>
+      </w:r>
+      <w:r>
+        <w:rPr>
+          <w:rFonts w:ascii="Calibri" w:hAnsi="Calibri" w:cs="Calibri"/>
+          <w:b/>
+          <w:bCs/>
+          <w:sz w:val="34"/>
+          <w:szCs w:val="34"/>
+        </w:rPr>
+        <w:t>id</w:t>
+      </w:r>
+      <w:r>
+        <w:rPr>
+          <w:rFonts w:ascii="Calibri" w:hAnsi="Calibri" w:cs="Calibri"/>
+          <w:sz w:val="34"/>
+          <w:szCs w:val="34"/>
+        </w:rPr>
+        <w:t>, drag-and-drop Gmail triggers id</w:t>
+      </w:r>
+    </w:p>
+    <w:p>
+      <w:pPr>
+        <w:jc w:val="both"/>
+        <w:rPr>
+          <w:rFonts w:ascii="Calibri" w:hAnsi="Calibri" w:cs="Calibri"/>
+          <w:sz w:val="34"/>
+          <w:szCs w:val="34"/>
+        </w:rPr>
+      </w:pPr>
+      <w:r>
+        <w:rPr>
+          <w:rFonts w:ascii="Calibri" w:hAnsi="Calibri" w:cs="Calibri"/>
+          <w:sz w:val="34"/>
+          <w:szCs w:val="34"/>
         </w:rPr>
         <w:lastRenderedPageBreak/>
-        <w:t xml:space="preserve"># Sing in here, in the credential section. Then select </w:t>
-      </w:r>
-      <w:r>
-        <w:rPr>
-          <w:rFonts w:ascii="Calibri" w:hAnsi="Calibri" w:cs="Calibri"/>
-          <w:b/>
-          <w:bCs/>
-          <w:sz w:val="36"/>
-          <w:szCs w:val="36"/>
-        </w:rPr>
-        <w:t xml:space="preserve">Resource </w:t>
-      </w:r>
-      <w:r>
-        <w:rPr>
-          <w:rFonts w:ascii="Calibri" w:hAnsi="Calibri" w:cs="Calibri"/>
-          <w:sz w:val="36"/>
-          <w:szCs w:val="36"/>
-        </w:rPr>
-        <w:t>to</w:t>
-      </w:r>
-      <w:r>
-        <w:rPr>
-          <w:rFonts w:ascii="Calibri" w:hAnsi="Calibri" w:cs="Calibri"/>
-          <w:b/>
-          <w:bCs/>
-          <w:sz w:val="36"/>
-          <w:szCs w:val="36"/>
-        </w:rPr>
-        <w:t xml:space="preserve"> message</w:t>
-      </w:r>
-      <w:r>
-        <w:rPr>
-          <w:rFonts w:ascii="Calibri" w:hAnsi="Calibri" w:cs="Calibri"/>
-          <w:sz w:val="36"/>
-          <w:szCs w:val="36"/>
-        </w:rPr>
-        <w:t xml:space="preserve"> and </w:t>
-      </w:r>
-      <w:r>
-        <w:rPr>
-          <w:rFonts w:ascii="Calibri" w:hAnsi="Calibri" w:cs="Calibri"/>
-          <w:b/>
-          <w:bCs/>
-          <w:sz w:val="36"/>
-          <w:szCs w:val="36"/>
-        </w:rPr>
-        <w:t>Operation</w:t>
-      </w:r>
-      <w:r>
-        <w:rPr>
-          <w:rFonts w:ascii="Calibri" w:hAnsi="Calibri" w:cs="Calibri"/>
-          <w:sz w:val="36"/>
-          <w:szCs w:val="36"/>
-        </w:rPr>
-        <w:t xml:space="preserve"> to</w:t>
-      </w:r>
-      <w:r>
-        <w:rPr>
-          <w:rFonts w:ascii="Calibri" w:hAnsi="Calibri" w:cs="Calibri"/>
-          <w:b/>
-          <w:bCs/>
-          <w:sz w:val="36"/>
-          <w:szCs w:val="36"/>
-        </w:rPr>
-        <w:t xml:space="preserve"> reply</w:t>
-      </w:r>
-      <w:r>
-        <w:rPr>
-          <w:rFonts w:ascii="Calibri" w:hAnsi="Calibri" w:cs="Calibri"/>
-          <w:b/>
-          <w:bCs/>
-          <w:sz w:val="36"/>
-          <w:szCs w:val="36"/>
-        </w:rPr>
-        <w:t xml:space="preserve"> </w:t>
-      </w:r>
-      <w:r>
-        <w:rPr>
-          <w:rFonts w:ascii="Calibri" w:hAnsi="Calibri" w:cs="Calibri"/>
-          <w:sz w:val="36"/>
-          <w:szCs w:val="36"/>
-        </w:rPr>
-        <w:t>(we can also set a bunch of things here like send and wait for response)</w:t>
-      </w:r>
-    </w:p>
-    <w:p>
-      <w:pPr>
-        <w:jc w:val="both"/>
-        <w:rPr>
-          <w:rFonts w:ascii="Calibri" w:hAnsi="Calibri" w:cs="Calibri"/>
-          <w:sz w:val="36"/>
-          <w:szCs w:val="36"/>
-        </w:rPr>
-      </w:pPr>
-      <w:r>
-        <w:rPr>
-          <w:rFonts w:ascii="Calibri" w:hAnsi="Calibri" w:cs="Calibri"/>
-          <w:sz w:val="36"/>
-          <w:szCs w:val="36"/>
-        </w:rPr>
-        <w:t xml:space="preserve"># In the </w:t>
-      </w:r>
-      <w:r>
-        <w:rPr>
-          <w:rFonts w:ascii="Calibri" w:hAnsi="Calibri" w:cs="Calibri"/>
-          <w:b/>
-          <w:bCs/>
-          <w:sz w:val="36"/>
-          <w:szCs w:val="36"/>
+        <w:t xml:space="preserve"># Then in the </w:t>
+      </w:r>
+      <w:r>
+        <w:rPr>
+          <w:rFonts w:ascii="Calibri" w:hAnsi="Calibri" w:cs="Calibri"/>
+          <w:b/>
+          <w:bCs/>
+          <w:sz w:val="34"/>
+          <w:szCs w:val="34"/>
         </w:rPr>
         <w:t>message</w:t>
       </w:r>
       <w:r>
         <w:rPr>
           <w:rFonts w:ascii="Calibri" w:hAnsi="Calibri" w:cs="Calibri"/>
-          <w:sz w:val="36"/>
-          <w:szCs w:val="36"/>
-        </w:rPr>
-        <w:t xml:space="preserve"> </w:t>
-      </w:r>
-      <w:r>
-        <w:rPr>
-          <w:rFonts w:ascii="Calibri" w:hAnsi="Calibri" w:cs="Calibri"/>
-          <w:b/>
-          <w:bCs/>
-          <w:sz w:val="36"/>
-          <w:szCs w:val="36"/>
-        </w:rPr>
-        <w:t>id</w:t>
-      </w:r>
-      <w:r>
-        <w:rPr>
-          <w:rFonts w:ascii="Calibri" w:hAnsi="Calibri" w:cs="Calibri"/>
-          <w:sz w:val="36"/>
-          <w:szCs w:val="36"/>
-        </w:rPr>
-        <w:t>, drag-and-drop Gmail triggers id</w:t>
-      </w:r>
-    </w:p>
-    <w:p>
-      <w:pPr>
-        <w:jc w:val="both"/>
-        <w:rPr>
-          <w:rFonts w:ascii="Calibri" w:hAnsi="Calibri" w:cs="Calibri"/>
-          <w:sz w:val="36"/>
-          <w:szCs w:val="36"/>
-        </w:rPr>
-      </w:pPr>
-      <w:r>
-        <w:rPr>
-          <w:rFonts w:ascii="Calibri" w:hAnsi="Calibri" w:cs="Calibri"/>
-          <w:sz w:val="36"/>
-          <w:szCs w:val="36"/>
-        </w:rPr>
-        <w:t xml:space="preserve"># Then in the </w:t>
-      </w:r>
-      <w:r>
-        <w:rPr>
-          <w:rFonts w:ascii="Calibri" w:hAnsi="Calibri" w:cs="Calibri"/>
-          <w:b/>
-          <w:bCs/>
-          <w:sz w:val="36"/>
-          <w:szCs w:val="36"/>
-        </w:rPr>
-        <w:t>message</w:t>
-      </w:r>
-      <w:r>
-        <w:rPr>
-          <w:rFonts w:ascii="Calibri" w:hAnsi="Calibri" w:cs="Calibri"/>
-          <w:sz w:val="36"/>
-          <w:szCs w:val="36"/>
+          <w:sz w:val="34"/>
+          <w:szCs w:val="34"/>
         </w:rPr>
         <w:t>, drag-and-drop</w:t>
       </w:r>
@@ -2933,16 +2935,16 @@
           <w:rFonts w:ascii="Calibri" w:hAnsi="Calibri" w:cs="Calibri"/>
           <w:b/>
           <w:bCs/>
-          <w:sz w:val="36"/>
-          <w:szCs w:val="36"/>
+          <w:sz w:val="34"/>
+          <w:szCs w:val="34"/>
         </w:rPr>
         <w:t xml:space="preserve"> AI-Agent</w:t>
       </w:r>
       <w:r>
         <w:rPr>
           <w:rFonts w:ascii="Calibri" w:hAnsi="Calibri" w:cs="Calibri"/>
-          <w:sz w:val="36"/>
-          <w:szCs w:val="36"/>
+          <w:sz w:val="34"/>
+          <w:szCs w:val="34"/>
         </w:rPr>
         <w:t>’s output (we can also add some custom things here)</w:t>
       </w:r>
@@ -2952,15 +2954,15 @@
         <w:jc w:val="both"/>
         <w:rPr>
           <w:rFonts w:ascii="Calibri" w:hAnsi="Calibri" w:cs="Calibri"/>
-          <w:sz w:val="36"/>
-          <w:szCs w:val="36"/>
-        </w:rPr>
-      </w:pPr>
-      <w:r>
-        <w:rPr>
-          <w:rFonts w:ascii="Calibri" w:hAnsi="Calibri" w:cs="Calibri"/>
-          <w:sz w:val="36"/>
-          <w:szCs w:val="36"/>
+          <w:sz w:val="34"/>
+          <w:szCs w:val="34"/>
+        </w:rPr>
+      </w:pPr>
+      <w:r>
+        <w:rPr>
+          <w:rFonts w:ascii="Calibri" w:hAnsi="Calibri" w:cs="Calibri"/>
+          <w:sz w:val="34"/>
+          <w:szCs w:val="34"/>
         </w:rPr>
         <w:t xml:space="preserve"># Finally, we have </w:t>
       </w:r>
@@ -2969,16 +2971,16 @@
           <w:rFonts w:ascii="Calibri" w:hAnsi="Calibri" w:cs="Calibri"/>
           <w:b/>
           <w:bCs/>
-          <w:sz w:val="36"/>
-          <w:szCs w:val="36"/>
+          <w:sz w:val="34"/>
+          <w:szCs w:val="34"/>
         </w:rPr>
         <w:t>Options</w:t>
       </w:r>
       <w:r>
         <w:rPr>
           <w:rFonts w:ascii="Calibri" w:hAnsi="Calibri" w:cs="Calibri"/>
-          <w:sz w:val="36"/>
-          <w:szCs w:val="36"/>
+          <w:sz w:val="34"/>
+          <w:szCs w:val="34"/>
         </w:rPr>
         <w:t xml:space="preserve">, click on </w:t>
       </w:r>
@@ -2987,16 +2989,16 @@
           <w:rFonts w:ascii="Calibri" w:hAnsi="Calibri" w:cs="Calibri"/>
           <w:b/>
           <w:bCs/>
-          <w:sz w:val="36"/>
-          <w:szCs w:val="36"/>
+          <w:sz w:val="34"/>
+          <w:szCs w:val="34"/>
         </w:rPr>
         <w:t>add option</w:t>
       </w:r>
       <w:r>
         <w:rPr>
           <w:rFonts w:ascii="Calibri" w:hAnsi="Calibri" w:cs="Calibri"/>
-          <w:sz w:val="36"/>
-          <w:szCs w:val="36"/>
+          <w:sz w:val="34"/>
+          <w:szCs w:val="34"/>
         </w:rPr>
         <w:t xml:space="preserve"> and select </w:t>
       </w:r>
@@ -3005,16 +3007,16 @@
           <w:rFonts w:ascii="Calibri" w:hAnsi="Calibri" w:cs="Calibri"/>
           <w:b/>
           <w:bCs/>
-          <w:sz w:val="36"/>
-          <w:szCs w:val="36"/>
+          <w:sz w:val="34"/>
+          <w:szCs w:val="34"/>
         </w:rPr>
         <w:t>append n8n attribution</w:t>
       </w:r>
       <w:r>
         <w:rPr>
           <w:rFonts w:ascii="Calibri" w:hAnsi="Calibri" w:cs="Calibri"/>
-          <w:sz w:val="36"/>
-          <w:szCs w:val="36"/>
+          <w:sz w:val="34"/>
+          <w:szCs w:val="34"/>
         </w:rPr>
         <w:t xml:space="preserve"> and disable it. In this way no n8n labels will be showed. Then click on </w:t>
       </w:r>
@@ -3023,8 +3025,8 @@
           <w:rFonts w:ascii="Calibri" w:hAnsi="Calibri" w:cs="Calibri"/>
           <w:b/>
           <w:bCs/>
-          <w:sz w:val="36"/>
-          <w:szCs w:val="36"/>
+          <w:sz w:val="34"/>
+          <w:szCs w:val="34"/>
         </w:rPr>
         <w:t>execute step</w:t>
       </w:r>
@@ -3034,25 +3036,25 @@
         <w:jc w:val="both"/>
         <w:rPr>
           <w:rFonts w:ascii="Calibri" w:hAnsi="Calibri" w:cs="Calibri"/>
-          <w:sz w:val="36"/>
-          <w:szCs w:val="36"/>
-        </w:rPr>
-      </w:pPr>
-    </w:p>
-    <w:p>
-      <w:pPr>
-        <w:jc w:val="both"/>
-        <w:rPr>
-          <w:rFonts w:ascii="Calibri" w:hAnsi="Calibri" w:cs="Calibri"/>
-          <w:sz w:val="36"/>
-          <w:szCs w:val="36"/>
-        </w:rPr>
-      </w:pPr>
-      <w:r>
-        <w:rPr>
-          <w:rFonts w:ascii="Calibri" w:hAnsi="Calibri" w:cs="Calibri"/>
-          <w:sz w:val="36"/>
-          <w:szCs w:val="36"/>
+          <w:sz w:val="34"/>
+          <w:szCs w:val="34"/>
+        </w:rPr>
+      </w:pPr>
+    </w:p>
+    <w:p>
+      <w:pPr>
+        <w:jc w:val="both"/>
+        <w:rPr>
+          <w:rFonts w:ascii="Calibri" w:hAnsi="Calibri" w:cs="Calibri"/>
+          <w:sz w:val="34"/>
+          <w:szCs w:val="34"/>
+        </w:rPr>
+      </w:pPr>
+      <w:r>
+        <w:rPr>
+          <w:rFonts w:ascii="Calibri" w:hAnsi="Calibri" w:cs="Calibri"/>
+          <w:sz w:val="34"/>
+          <w:szCs w:val="34"/>
         </w:rPr>
         <w:t>Publishing:</w:t>
       </w:r>
@@ -3062,39 +3064,39 @@
         <w:jc w:val="both"/>
         <w:rPr>
           <w:rFonts w:ascii="Calibri" w:hAnsi="Calibri" w:cs="Calibri"/>
-          <w:sz w:val="36"/>
-          <w:szCs w:val="36"/>
-        </w:rPr>
-      </w:pPr>
-      <w:r>
-        <w:rPr>
-          <w:rFonts w:ascii="Calibri" w:hAnsi="Calibri" w:cs="Calibri"/>
-          <w:sz w:val="36"/>
-          <w:szCs w:val="36"/>
+          <w:sz w:val="34"/>
+          <w:szCs w:val="34"/>
+        </w:rPr>
+      </w:pPr>
+      <w:r>
+        <w:rPr>
+          <w:rFonts w:ascii="Calibri" w:hAnsi="Calibri" w:cs="Calibri"/>
+          <w:sz w:val="34"/>
+          <w:szCs w:val="34"/>
         </w:rPr>
         <w:t># Then we can publish it and set when to check for emails like</w:t>
       </w:r>
       <w:r>
         <w:rPr>
           <w:rFonts w:ascii="Calibri" w:hAnsi="Calibri" w:cs="Calibri"/>
-          <w:sz w:val="36"/>
-          <w:szCs w:val="36"/>
+          <w:sz w:val="34"/>
+          <w:szCs w:val="34"/>
         </w:rPr>
         <w:t xml:space="preserve"> hour</w:t>
       </w:r>
       <w:r>
         <w:rPr>
           <w:rFonts w:ascii="Calibri" w:hAnsi="Calibri" w:cs="Calibri"/>
-          <w:sz w:val="36"/>
-          <w:szCs w:val="36"/>
+          <w:sz w:val="34"/>
+          <w:szCs w:val="34"/>
         </w:rPr>
         <w:t xml:space="preserve"> or </w:t>
       </w:r>
       <w:r>
         <w:rPr>
           <w:rFonts w:ascii="Calibri" w:hAnsi="Calibri" w:cs="Calibri"/>
-          <w:sz w:val="36"/>
-          <w:szCs w:val="36"/>
+          <w:sz w:val="34"/>
+          <w:szCs w:val="34"/>
         </w:rPr>
         <w:t>day</w:t>
       </w:r>
@@ -3104,48 +3106,48 @@
         <w:jc w:val="both"/>
         <w:rPr>
           <w:rFonts w:ascii="Calibri" w:hAnsi="Calibri" w:cs="Calibri"/>
-          <w:sz w:val="36"/>
-          <w:szCs w:val="36"/>
-        </w:rPr>
-      </w:pPr>
-    </w:p>
-    <w:p>
-      <w:pPr>
-        <w:jc w:val="both"/>
-        <w:rPr>
-          <w:rFonts w:ascii="Calibri" w:hAnsi="Calibri" w:cs="Calibri"/>
-          <w:sz w:val="36"/>
-          <w:szCs w:val="36"/>
-        </w:rPr>
-      </w:pPr>
-    </w:p>
-    <w:p>
-      <w:pPr>
-        <w:jc w:val="both"/>
-        <w:rPr>
-          <w:rFonts w:ascii="Calibri" w:hAnsi="Calibri" w:cs="Calibri"/>
-          <w:sz w:val="36"/>
-          <w:szCs w:val="36"/>
-        </w:rPr>
-      </w:pPr>
-    </w:p>
-    <w:p>
-      <w:pPr>
-        <w:jc w:val="both"/>
-        <w:rPr>
-          <w:rFonts w:ascii="Calibri" w:hAnsi="Calibri" w:cs="Calibri"/>
-          <w:sz w:val="36"/>
-          <w:szCs w:val="36"/>
-        </w:rPr>
-      </w:pPr>
-    </w:p>
-    <w:p>
-      <w:pPr>
-        <w:jc w:val="both"/>
-        <w:rPr>
-          <w:rFonts w:ascii="Calibri" w:hAnsi="Calibri" w:cs="Calibri"/>
-          <w:sz w:val="36"/>
-          <w:szCs w:val="36"/>
+          <w:sz w:val="34"/>
+          <w:szCs w:val="34"/>
+        </w:rPr>
+      </w:pPr>
+    </w:p>
+    <w:p>
+      <w:pPr>
+        <w:jc w:val="both"/>
+        <w:rPr>
+          <w:rFonts w:ascii="Calibri" w:hAnsi="Calibri" w:cs="Calibri"/>
+          <w:sz w:val="34"/>
+          <w:szCs w:val="34"/>
+        </w:rPr>
+      </w:pPr>
+    </w:p>
+    <w:p>
+      <w:pPr>
+        <w:jc w:val="both"/>
+        <w:rPr>
+          <w:rFonts w:ascii="Calibri" w:hAnsi="Calibri" w:cs="Calibri"/>
+          <w:sz w:val="34"/>
+          <w:szCs w:val="34"/>
+        </w:rPr>
+      </w:pPr>
+    </w:p>
+    <w:p>
+      <w:pPr>
+        <w:jc w:val="both"/>
+        <w:rPr>
+          <w:rFonts w:ascii="Calibri" w:hAnsi="Calibri" w:cs="Calibri"/>
+          <w:sz w:val="34"/>
+          <w:szCs w:val="34"/>
+        </w:rPr>
+      </w:pPr>
+    </w:p>
+    <w:p>
+      <w:pPr>
+        <w:jc w:val="both"/>
+        <w:rPr>
+          <w:rFonts w:ascii="Calibri" w:hAnsi="Calibri" w:cs="Calibri"/>
+          <w:sz w:val="34"/>
+          <w:szCs w:val="34"/>
         </w:rPr>
       </w:pPr>
     </w:p>

</xml_diff>